<commit_message>
Change 55: 1(j)/1(k) merged, 1(n) moved to supporting records, concession removed, s 32(5) particulars direction sought, comments stripped
Co-Authored-By: Claude Opus 5.5 <noreply@anthropic.com>
Claude-Session: https://claude.ai/code/session_01PbSZiMB1koFR46V5hQyVcy
</commit_message>
<xml_diff>
--- a/wc2024227/drafts/second-amended-9A/v2_1Oct2026_your_structure/2026-10_LETTER_to_Registry_FINAL.docx
+++ b/wc2024227/drafts/second-amended-9A/v2_1Oct2026_your_structure/2026-10_LETTER_to_Registry_FINAL.docx
@@ -146,7 +146,6 @@
       <w:pPr>
         <w:spacing w:before="0" w:after="80" w:line="264" w:lineRule="auto"/>
       </w:pPr>
-      <w:commentRangeStart w:id="0"/>
       <w:r>
         <w:rPr>
           <w:rFonts w:ascii="Arial" w:hAnsi="Arial" w:cs="Arial"/>
@@ -165,7 +164,6 @@
         </w:rPr>
         <w:t>The Appellant applies for leave to file and serve the enclosed Second Amended Statement of Facts and Contentions (Form 9A), under the Commission's power to give directions (Industrial Relations Act 2016, section 451(2)). A copy goes to the Respondent with this letter, and its consent is sought. The amendment is sought because the matter has become much clearer since the Amended Form 9A of 7 April 2026. The Respondent has admitted 298 of the 303 facts in the Appellant's notice of 28 August 2026. It has admitted, or has since confirmed, 29 of the 39 documents behind them. The Second Amended Form 9A accepts that the onus of proof is on the Appellant, withdraws the descriptions of conduct used in the earlier pleading, identifies the admissions supporting each stressor and distinguishes them from the other documents and the Appellant's own evidence, states the contentions and the questions for decision on that footing, and adds no new allegation. No hearing date has been set, so the amendment is sought before the matter is listed and before either party prepares for hearing on the earlier pleading. The Appellant does not oppose the Respondent having time to amend its own statement of facts and contentions if it wishes. The pleading sets out the admitted facts under the stressor each one supports, with the paragraph number of the admission against each, so that the whole case can be read in one document. The three themes are retained, with dated lettered particulars and an event list following Part 4.8 of the Appeal Guide. Duties, standards, medical links and the Respondent's pleaded explanations are unlettered. Each theme and its particulars can be understood independently; where a fact matters to more than one stressor it is repeated, and the pleading says so. The schedule to this letter lists the documents relied on, other than the treating medical records served on 9 September 2026, and their status.</w:t>
       </w:r>
-      <w:commentRangeEnd w:id="0"/>
       <w:r>
         <w:rPr>
           <w:rStyle w:val="CommentReference"/>
@@ -285,6 +283,28 @@
     </w:p>
     <w:p>
       <w:pPr>
+        <w:spacing w:before="0" w:after="80" w:line="264" w:lineRule="auto"/>
+      </w:pPr>
+      <w:r>
+        <w:rPr>
+          <w:rFonts w:ascii="Arial" w:hAnsi="Arial" w:cs="Arial"/>
+          <w:b/>
+          <w:sz w:val="19"/>
+          <w:szCs w:val="19"/>
+        </w:rPr>
+        <w:t xml:space="preserve">The Respondent's section 32(5) contention. </w:t>
+      </w:r>
+      <w:r>
+        <w:rPr>
+          <w:rFonts w:ascii="Arial" w:hAnsi="Arial" w:cs="Arial"/>
+          <w:sz w:val="19"/>
+          <w:szCs w:val="19"/>
+        </w:rPr>
+        <w:t>Paragraph 27 of the Respondent's amended statement of facts and contentions of 13 May 2026 contends that any management action was reasonable management action taken in a reasonable way. The Respondent admitted on 8 September 2026 that paragraph 27 does not identify, by particular, date, document or cross-reference, the management action relied upon (fact 303). The Second Amended Form 9A now sets out each particular by date. The Appellant asks that the Respondent be directed to state, for each particular, whether it contends that it was management action and, if so, the facts relied on to say it was reasonable and taken in a reasonable way (item 4 of the election), so that the issues for the conference and any hearing are identified.</w:t>
+      </w:r>
+    </w:p>
+    <w:p>
+      <w:pPr>
         <w:spacing w:before="0" w:after="200" w:line="264" w:lineRule="auto"/>
       </w:pPr>
       <w:r>
@@ -4778,7 +4798,7 @@
                 <w:sz w:val="16"/>
                 <w:szCs w:val="16"/>
               </w:rPr>
-              <w:t>Taylor, "Good morning Team." (Stressor 1(n))</w:t>
+              <w:t>Taylor, "Good morning Team." (Stressor 1, supporting records)</w:t>
             </w:r>
           </w:p>
         </w:tc>
@@ -7324,27 +7344,6 @@
     </w:sectPr>
   </w:body>
 </w:document>
-</file>
-
-<file path=word/comments.xml><?xml version="1.0" encoding="utf-8"?>
-<w:comments xmlns:a="http://schemas.openxmlformats.org/drawingml/2006/main" xmlns:pic="http://schemas.openxmlformats.org/drawingml/2006/picture" xmlns:r="http://schemas.openxmlformats.org/officeDocument/2006/relationships" xmlns:w="http://schemas.openxmlformats.org/wordprocessingml/2006/main" xmlns:wp="http://schemas.openxmlformats.org/drawingml/2006/wordprocessingDrawing" xmlns:mc="http://schemas.openxmlformats.org/markup-compatibility/2006" xmlns:a14="http://schemas.microsoft.com/office/drawing/2010/main" xmlns:w14="http://schemas.microsoft.com/office/word/2010/wordml" xmlns:wpc="http://schemas.microsoft.com/office/word/2010/wordprocessingCanvas">
-  <w:comment w:id="0" w:author="Review" w:initials="R" w:date="2026-09-30T16:19:16Z">
-    <w:p>
-      <w:pPr>
-        <w:pStyle w:val="CommentText"/>
-      </w:pPr>
-      <w:r>
-        <w:rPr>
-          <w:rStyle w:val="CommentReference"/>
-        </w:rPr>
-        <w:annotationRef/>
-      </w:r>
-      <w:r>
-        <w:t>Updated to explain the thematic/event structure and to distinguish formal admissions from other relied-on evidence. The existing assertion that this adds no new allegation is retained on the footing that only the attached draft is being reorganised; compare with the filed April pleading before filing if its scope is disputed.</w:t>
-      </w:r>
-    </w:p>
-  </w:comment>
-</w:comments>
 </file>
 
 <file path=word/styles.xml><?xml version="1.0" encoding="utf-8"?>

</xml_diff>

<commit_message>
Change 60: pressure review applied: election opening-of-conference direction, letter notified-case block and Schedule Part 3 index, 9A three-row list and C.11
Co-Authored-By: Claude Opus 5.5 <noreply@anthropic.com>
Claude-Session: https://claude.ai/code/session_01PbSZiMB1koFR46V5hQyVcy
</commit_message>
<xml_diff>
--- a/wc2024227/drafts/second-amended-9A/v2_1Oct2026_your_structure/2026-10_LETTER_to_Registry_FINAL.docx
+++ b/wc2024227/drafts/second-amended-9A/v2_1Oct2026_your_structure/2026-10_LETTER_to_Registry_FINAL.docx
@@ -139,7 +139,7 @@
           <w:sz w:val="19"/>
           <w:szCs w:val="19"/>
         </w:rPr>
-        <w:t>Under direction 5 of the Further Directions Order (3) of 19 August 2026, the Appellant elects a further conference under section 552A of the Workers' Compensation and Rehabilitation Act 2003, and asks that the application below be dealt with at or before it.</w:t>
+        <w:t>Under direction 5 of the Further Directions Order (3) of 19 August 2026, the Appellant elects a further conference under section 552A of the Workers' Compensation and Rehabilitation Act 2003, and asks that the application below be dealt with at or before it. This election is made on 1 October 2026, the day after the time for the Respondent's list of witnesses, outlines of evidence and expert reports under directions 3 and 4 expired.</w:t>
       </w:r>
     </w:p>
     <w:p>
@@ -162,7 +162,7 @@
           <w:sz w:val="19"/>
           <w:szCs w:val="19"/>
         </w:rPr>
-        <w:t>The Appellant applies for leave to file and serve the enclosed Second Amended Statement of Facts and Contentions (Form 9A), under the Commission's power to give directions (Industrial Relations Act 2016, section 451(2)). A copy goes to the Respondent with this letter, and its consent is sought. The amendment is sought because the matter has become much clearer since the Amended Form 9A of 7 April 2026. The Respondent has admitted 298 of the 303 facts in the Appellant's notice of 28 August 2026. It has admitted, or has since confirmed, 29 of the 39 documents behind them. The Second Amended Form 9A accepts that the onus of proof is on the Appellant, withdraws the descriptions of conduct used in the earlier pleading, identifies the admissions supporting each stressor and distinguishes them from the other documents and the Appellant's own evidence, states the contentions and the questions for decision on that footing, and adds no new stressor or allegation; its further particulars are drawn from the admitted facts and the documents identified in the schedule. No hearing date has been set, so the amendment is sought before the matter is listed and before either party prepares for hearing on the earlier pleading. The Appellant does not oppose the Respondent having time to amend its own statement of facts and contentions if it wishes. The pleading sets out the admitted facts under the stressor each one supports, with the paragraph number of the admission against each, so that the whole case can be read in one document. The three themes are retained, with dated lettered particulars and an event list following Part 4.8 of the Appeal Guide. Duties, standards, medical links and the Respondent's pleaded explanations are unlettered. Each theme and its particulars can be understood independently; where a fact matters to more than one stressor it is repeated, and the pleading says so. The schedule to this letter lists the documents relied on, other than the treating medical records served on 9 September 2026, and their status.</w:t>
+        <w:t>The Appellant applies for leave to file and serve the enclosed Second Amended Statement of Facts and Contentions (Form 9A), under the Commission's power to give directions (Industrial Relations Act 2016, section 451(2)). A copy goes to the Respondent with this letter, and its consent is sought. The amendment is sought because the matter has become much clearer since the Amended Form 9A of 7 April 2026. The Respondent has admitted 298 of the 303 facts in the Appellant's notice of 28 August 2026. It has admitted, or has since confirmed, 29 of the 39 documents behind them. The Second Amended Form 9A accepts that the onus of proof is on the Appellant, withdraws the descriptions of conduct used in the earlier pleading, identifies the admissions supporting each stressor and distinguishes them from the other documents and the Appellant's own evidence, states the contentions and the questions for decision on that footing, and adds no new stressor or allegation; its further particulars are drawn from the admitted facts and the documents identified in the schedule. No hearing date has been set, so the amendment is sought before the matter is listed and before either party prepares for hearing on the earlier pleading. The Appellant does not oppose the Respondent having time to amend its own statement of facts and contentions if it wishes. The pleading sets out the admitted facts under the stressor each one supports, with the paragraph number of the admission against each, so that the whole case can be read in one document. The three stressors are retained, with dated lettered particulars; the list of stressors follows Part 4.8 of the Appeal Guide, and Part 3 of the schedule indexes the particulars. Duties, standards, medical links and the Respondent's pleaded explanations are unlettered. Each theme and its particulars can be understood independently; where a fact matters to more than one stressor it is repeated, and the pleading says so. The schedule to this letter lists the documents relied on, other than the treating medical records served on 9 September 2026, and their status.</w:t>
       </w:r>
       <w:r>
         <w:rPr>
@@ -213,6 +213,28 @@
           <w:szCs w:val="19"/>
         </w:rPr>
         <w:t>Directions 3 and 4 of the Further Directions Order (3) required the Respondent's list of witnesses, its outlines of evidence and any expert reports that will be relied upon by 4.00 pm on 30 September 2026. On 24 September 2026 it sent its list to the Registry for filing, naming four witnesses, Ms Taylor, Ms Reese, Ms Wright and Ms Earl, described as "lay" witnesses, and served outlines of their evidence. Neither the list nor the outlines names a medical or expert witness, and no expert report has been served as at 30 September 2026. The Respondent's amended statement of facts and contentions of 13 May 2026 does not admit the pleaded onset and diagnosis of the injury, saying these are "matters for determination by the Commission at a hearing" (paragraph 9), and identifies no expert evidence. Its response of 8 September 2026 to the notices to admit names no medical or expert witness, and the documents listed under the headings "Medical Certificates" and "Medical" in its amended List of Documents of 14 August 2026 are those of the treating practitioners (items 7 to 11).</w:t>
+      </w:r>
+    </w:p>
+    <w:p>
+      <w:pPr>
+        <w:spacing w:before="0" w:after="80" w:line="264" w:lineRule="auto"/>
+      </w:pPr>
+      <w:r>
+        <w:rPr>
+          <w:rFonts w:ascii="Arial" w:hAnsi="Arial" w:cs="Arial"/>
+          <w:b/>
+          <w:sz w:val="19"/>
+          <w:szCs w:val="19"/>
+        </w:rPr>
+        <w:t xml:space="preserve">The Respondent's notified case as at 30 September 2026. </w:t>
+      </w:r>
+      <w:r>
+        <w:rPr>
+          <w:rFonts w:ascii="Arial" w:hAnsi="Arial" w:cs="Arial"/>
+          <w:sz w:val="19"/>
+          <w:szCs w:val="19"/>
+        </w:rPr>
+        <w:t xml:space="preserve">(1) Its review decision of 24 October 2024 found that the Appellant sustained a personal injury of a psychological nature, arising out of employment to the extent it arose out of factors 2, 3 and 4, where employment was a significant contributing factor (facts 261 and 262); the claim was rejected under section 32(5). (2) Paragraph 27 of its amended statement of facts and contentions, which contends that any management action was reasonable management action taken in a reasonable way, does not identify the management action relied upon; that was admitted on 8 September 2026 (fact 303). (3) It has named no medical or expert witness and served no expert report. (4) Its outlines of evidence state that the seven-hour break of 17 to 18 March 2024 was "the result of human error" and, on the advice returned within payroll, "a rostering practice issue for the line manager"; and that the second decline of the paid Special Pandemic Leave request "appears to have been made in error". The Appellant asks that, at the opening of the conference, the Respondent be asked to state its position on paragraph 27 in light of those matters: whether it maintains it, will particularise it, or seeks time (items 2 and 5 of the election).</w:t>
       </w:r>
     </w:p>
     <w:p>
@@ -278,29 +300,7 @@
           <w:sz w:val="19"/>
           <w:szCs w:val="19"/>
         </w:rPr>
-        <w:t>Part 1 of the schedule on the following pages states the status of each of the 39 documents at Annexure A to the notices of 28 August 2026; Part 2 lists the other documents the pleading relies on. The Appellant asks that the Respondent be directed to state, by a date the Commission fixes, whether it disputes the authenticity of each of the ten outstanding documents and on what ground; and that, if it does not, they be received at hearing subject to proof.</w:t>
-      </w:r>
-    </w:p>
-    <w:p>
-      <w:pPr>
-        <w:spacing w:before="0" w:after="80" w:line="264" w:lineRule="auto"/>
-      </w:pPr>
-      <w:r>
-        <w:rPr>
-          <w:rFonts w:ascii="Arial" w:hAnsi="Arial" w:cs="Arial"/>
-          <w:b/>
-          <w:sz w:val="19"/>
-          <w:szCs w:val="19"/>
-        </w:rPr>
-        <w:t xml:space="preserve">The Respondent's section 32(5) contention. </w:t>
-      </w:r>
-      <w:r>
-        <w:rPr>
-          <w:rFonts w:ascii="Arial" w:hAnsi="Arial" w:cs="Arial"/>
-          <w:sz w:val="19"/>
-          <w:szCs w:val="19"/>
-        </w:rPr>
-        <w:t>Paragraph 27 of the Respondent's amended statement of facts and contentions of 13 May 2026 contends that any management action was reasonable management action taken in a reasonable way. The Respondent admitted on 8 September 2026 that paragraph 27 does not identify, by particular, date, document or cross-reference, the management action relied upon (fact 303). The Second Amended Form 9A now sets out each particular by date. The Appellant asks that the Respondent be directed to state, for each particular, whether it contends that it was management action and, if so, the facts relied on to say it was reasonable and taken in a reasonable way (item 4 of the election), so that the issues for the conference and any hearing are identified.</w:t>
+        <w:t>Part 1 of the schedule on the following pages states the status of each of the 39 documents at Annexure A to the notices of 28 August 2026; Part 2 lists the other documents the pleading relies on; Part 3 indexes the dated particulars of the Second Amended Form 9A and adds no stressor. The Appellant asks that the Respondent be directed to state, by a date the Commission fixes, whether it disputes the authenticity of each of the ten outstanding documents and on what ground; and that, if it does not, they be received at hearing subject to proof.</w:t>
       </w:r>
     </w:p>
     <w:p>
@@ -319,7 +319,7 @@
         <w:rPr>
           <w:sz w:val="19"/>
         </w:rPr>
-        <w:t xml:space="preserve"> The combined package is 33 pages. In view of Practice Direction 3 of 2021, the Appellant seeks directions about providing hard copies or permission to file the complete package electronically.</w:t>
+        <w:t xml:space="preserve"> The combined package exceeds 30 pages. In view of Practice Direction 3 of 2021, the Appellant seeks directions about providing hard copies or permission to file the complete package electronically.</w:t>
       </w:r>
     </w:p>
     <w:p>
@@ -7335,9 +7335,3754 @@
           <w:sz w:val="19"/>
           <w:szCs w:val="19"/>
         </w:rPr>
-        <w:t>The Appellant asked the Respondent on 9 September 2026 to confirm the ten outstanding documents. The Respondent's email of 23 September 2026 gives no date by which the copies are expected, and does not refer to Tab 24, which is a Together Queensland document, not a Metro South Health document. The nine documents the Respondent referred to Metro South Health are Metro South Health documents. The copies of Tabs 1, 5, 17 to 19, 21 to 24 and 31 came from the Appellant's own records; Tabs 17 to 19, 22 and 23 bear the signature of the employer's Director, Corporate Services. If Metro South produces the same documents to the Respondent, and the Respondent discloses them back to the Appellant, he will receive documents he already holds. This letter accompanies the Appellant's election and requested directions (one page). Enclosure: Second Amended Statement of Facts and Contentions (Form 9A), 27 pages.</w:t>
+        <w:t>The Appellant asked the Respondent on 9 September 2026 to confirm the ten outstanding documents. The Respondent's email of 23 September 2026 gives no date by which the copies are expected, and does not refer to Tab 24, which is a Together Queensland document, not a Metro South Health document. The nine documents the Respondent referred to Metro South Health are Metro South Health documents. The copies of Tabs 1, 5, 17 to 19, 21 to 24 and 31 came from the Appellant's own records; Tabs 17 to 19, 22 and 23 bear the signature of the employer's Director, Corporate Services. If Metro South produces the same documents to the Respondent, and the Respondent discloses them back to the Appellant, he will receive documents he already holds. This letter accompanies the Appellant's election and requested directions. Enclosure: Second Amended Statement of Facts and Contentions (Form 9A).</w:t>
       </w:r>
     </w:p>
+    <w:p>
+      <w:pPr>
+        <w:spacing w:before="0" w:after="80" w:line="264" w:lineRule="auto"/>
+      </w:pPr>
+      <w:r>
+        <w:rPr>
+          <w:rFonts w:ascii="Arial" w:hAnsi="Arial" w:cs="Arial"/>
+          <w:b/>
+          <w:sz w:val="19"/>
+          <w:szCs w:val="19"/>
+        </w:rPr>
+        <w:t xml:space="preserve">Schedule, Part 3: index of the dated particulars in the Second Amended Form 9A (index only; not additional stressors). </w:t>
+      </w:r>
+      <w:r>
+        <w:rPr>
+          <w:rFonts w:ascii="Arial" w:hAnsi="Arial" w:cs="Arial"/>
+          <w:sz w:val="19"/>
+          <w:szCs w:val="19"/>
+        </w:rPr>
+        <w:t xml:space="preserve">The three stressors are pleaded, with their particulars, in the Second Amended Form 9A; this index adds no stressor or particular. The causal particulars are 1(b), 1(d), 1(f) to 1(h), 1(k) and 1(l); 2(a) to 2(j) and 2(l) to 2(n); and 3(b) to 3(h). The others, 1(a), 1(c), 1(e), 1(i), 1(j), 2(k), 2(o) and 3(a), are context and are not relied on as separate causes.</w:t>
+      </w:r>
+    </w:p>
+    <w:tbl>
+      <w:tblPr>
+        <w:tblW w:w="9638" w:type="dxa"/>
+        <w:tblBorders>
+          <w:top w:val="single" w:sz="4" w:color="D9D9D9"/>
+          <w:left w:val="single" w:sz="4" w:color="D9D9D9"/>
+          <w:bottom w:val="single" w:sz="4" w:color="D9D9D9"/>
+          <w:right w:val="single" w:sz="4" w:color="D9D9D9"/>
+          <w:insideH w:val="single" w:sz="4" w:color="D9D9D9"/>
+          <w:insideV w:val="single" w:sz="4" w:color="D9D9D9"/>
+        </w:tblBorders>
+      </w:tblPr>
+      <w:tblGrid>
+        <w:gridCol w:w="578"/>
+        <w:gridCol w:w="1927"/>
+        <w:gridCol w:w="1927"/>
+        <w:gridCol w:w="5204"/>
+      </w:tblGrid>
+      <w:tr>
+        <w:trPr>
+          <w:tblHeader/>
+          <w:tblHeader/>
+        </w:trPr>
+        <w:tc>
+          <w:tcPr>
+            <w:tcW w:type="dxa" w:w="652"/>
+            <w:shd w:val="clear" w:color="auto" w:fill="E8E8E8"/>
+            <w:tcMar>
+              <w:top w:w="65" w:type="dxa"/>
+              <w:left w:w="80" w:type="dxa"/>
+              <w:bottom w:w="65" w:type="dxa"/>
+              <w:right w:w="80" w:type="dxa"/>
+            </w:tcMar>
+          </w:tcPr>
+          <w:p>
+            <w:r>
+              <w:rPr>
+                <w:rFonts w:ascii="Arial" w:hAnsi="Arial"/>
+                <w:b/>
+                <w:color w:val="000000"/>
+                <w:sz w:val="18"/>
+              </w:rPr>
+              <w:t>No.</w:t>
+            </w:r>
+          </w:p>
+        </w:tc>
+        <w:tc>
+          <w:tcPr>
+            <w:tcW w:type="dxa" w:w="1616"/>
+            <w:shd w:val="clear" w:color="auto" w:fill="E8E8E8"/>
+            <w:tcMar>
+              <w:top w:w="65" w:type="dxa"/>
+              <w:left w:w="80" w:type="dxa"/>
+              <w:bottom w:w="65" w:type="dxa"/>
+              <w:right w:w="80" w:type="dxa"/>
+            </w:tcMar>
+          </w:tcPr>
+          <w:p>
+            <w:r>
+              <w:rPr>
+                <w:rFonts w:ascii="Arial" w:hAnsi="Arial"/>
+                <w:b/>
+                <w:color w:val="000000"/>
+                <w:sz w:val="18"/>
+              </w:rPr>
+              <w:t>Date or date range</w:t>
+            </w:r>
+          </w:p>
+        </w:tc>
+        <w:tc>
+          <w:tcPr>
+            <w:tcW w:type="dxa" w:w="2296"/>
+            <w:shd w:val="clear" w:color="auto" w:fill="E8E8E8"/>
+            <w:tcMar>
+              <w:top w:w="65" w:type="dxa"/>
+              <w:left w:w="80" w:type="dxa"/>
+              <w:bottom w:w="65" w:type="dxa"/>
+              <w:right w:w="80" w:type="dxa"/>
+            </w:tcMar>
+          </w:tcPr>
+          <w:p>
+            <w:r>
+              <w:rPr>
+                <w:rFonts w:ascii="Arial" w:hAnsi="Arial"/>
+                <w:b/>
+                <w:color w:val="000000"/>
+                <w:sz w:val="18"/>
+              </w:rPr>
+              <w:t>Particular</w:t>
+            </w:r>
+          </w:p>
+        </w:tc>
+        <w:tc>
+          <w:tcPr>
+            <w:tcW w:type="dxa" w:w="5017"/>
+            <w:shd w:val="clear" w:color="auto" w:fill="E8E8E8"/>
+            <w:tcMar>
+              <w:top w:w="65" w:type="dxa"/>
+              <w:left w:w="80" w:type="dxa"/>
+              <w:bottom w:w="65" w:type="dxa"/>
+              <w:right w:w="80" w:type="dxa"/>
+            </w:tcMar>
+          </w:tcPr>
+          <w:p>
+            <w:r>
+              <w:rPr>
+                <w:rFonts w:ascii="Arial" w:hAnsi="Arial"/>
+                <w:b/>
+                <w:color w:val="000000"/>
+                <w:sz w:val="18"/>
+              </w:rPr>
+              <w:t>Brief description</w:t>
+            </w:r>
+          </w:p>
+        </w:tc>
+      </w:tr>
+      <w:tr>
+        <w:trPr/>
+        <w:tc>
+          <w:tcPr>
+            <w:tcW w:type="dxa" w:w="652"/>
+            <w:tcMar>
+              <w:top w:w="65" w:type="dxa"/>
+              <w:left w:w="80" w:type="dxa"/>
+              <w:bottom w:w="65" w:type="dxa"/>
+              <w:right w:w="80" w:type="dxa"/>
+            </w:tcMar>
+          </w:tcPr>
+          <w:p>
+            <w:pPr>
+              <w:spacing w:after="40" w:before="40" w:line="252" w:lineRule="auto"/>
+            </w:pPr>
+            <w:r>
+              <w:rPr>
+                <w:rFonts w:ascii="Arial" w:hAnsi="Arial"/>
+                <w:b/>
+                <w:color w:val="000000"/>
+                <w:sz w:val="18"/>
+              </w:rPr>
+              <w:t>1(a)</w:t>
+            </w:r>
+          </w:p>
+        </w:tc>
+        <w:tc>
+          <w:tcPr>
+            <w:tcW w:type="dxa" w:w="1616"/>
+            <w:tcMar>
+              <w:top w:w="65" w:type="dxa"/>
+              <w:left w:w="80" w:type="dxa"/>
+              <w:bottom w:w="65" w:type="dxa"/>
+              <w:right w:w="80" w:type="dxa"/>
+            </w:tcMar>
+          </w:tcPr>
+          <w:p>
+            <w:pPr>
+              <w:spacing w:after="40" w:before="40" w:line="252" w:lineRule="auto"/>
+            </w:pPr>
+            <w:r>
+              <w:rPr>
+                <w:rFonts w:ascii="Arial" w:hAnsi="Arial"/>
+                <w:b w:val="0"/>
+                <w:color w:val="000000"/>
+                <w:sz w:val="18"/>
+              </w:rPr>
+              <w:t>on or around 6 June 2023</w:t>
+            </w:r>
+          </w:p>
+        </w:tc>
+        <w:tc>
+          <w:tcPr>
+            <w:tcW w:type="dxa" w:w="2296"/>
+            <w:tcMar>
+              <w:top w:w="65" w:type="dxa"/>
+              <w:left w:w="80" w:type="dxa"/>
+              <w:bottom w:w="65" w:type="dxa"/>
+              <w:right w:w="80" w:type="dxa"/>
+            </w:tcMar>
+          </w:tcPr>
+          <w:p>
+            <w:pPr>
+              <w:spacing w:after="40" w:before="40" w:line="252" w:lineRule="auto"/>
+            </w:pPr>
+            <w:r>
+              <w:rPr>
+                <w:rFonts w:ascii="Arial" w:hAnsi="Arial"/>
+                <w:b w:val="0"/>
+                <w:color w:val="000000"/>
+                <w:sz w:val="18"/>
+              </w:rPr>
+              <w:t>Removal of the Communication Book entry</w:t>
+            </w:r>
+          </w:p>
+        </w:tc>
+        <w:tc>
+          <w:tcPr>
+            <w:tcW w:type="dxa" w:w="5017"/>
+            <w:tcMar>
+              <w:top w:w="65" w:type="dxa"/>
+              <w:left w:w="80" w:type="dxa"/>
+              <w:bottom w:w="65" w:type="dxa"/>
+              <w:right w:w="80" w:type="dxa"/>
+            </w:tcMar>
+          </w:tcPr>
+          <w:p>
+            <w:pPr>
+              <w:spacing w:after="40" w:before="40" w:line="252" w:lineRule="auto"/>
+            </w:pPr>
+            <w:r>
+              <w:rPr>
+                <w:rFonts w:ascii="Arial" w:hAnsi="Arial"/>
+                <w:b w:val="0"/>
+                <w:color w:val="000000"/>
+                <w:sz w:val="18"/>
+              </w:rPr>
+              <w:t>Entry removed and management response recorded; context only.</w:t>
+            </w:r>
+          </w:p>
+        </w:tc>
+      </w:tr>
+      <w:tr>
+        <w:trPr/>
+        <w:tc>
+          <w:tcPr>
+            <w:tcW w:type="dxa" w:w="652"/>
+            <w:tcMar>
+              <w:top w:w="65" w:type="dxa"/>
+              <w:left w:w="80" w:type="dxa"/>
+              <w:bottom w:w="65" w:type="dxa"/>
+              <w:right w:w="80" w:type="dxa"/>
+            </w:tcMar>
+          </w:tcPr>
+          <w:p>
+            <w:pPr>
+              <w:spacing w:after="40" w:before="40" w:line="252" w:lineRule="auto"/>
+            </w:pPr>
+            <w:r>
+              <w:rPr>
+                <w:rFonts w:ascii="Arial" w:hAnsi="Arial"/>
+                <w:b/>
+                <w:color w:val="000000"/>
+                <w:sz w:val="18"/>
+              </w:rPr>
+              <w:t>1(b)</w:t>
+            </w:r>
+          </w:p>
+        </w:tc>
+        <w:tc>
+          <w:tcPr>
+            <w:tcW w:type="dxa" w:w="1616"/>
+            <w:tcMar>
+              <w:top w:w="65" w:type="dxa"/>
+              <w:left w:w="80" w:type="dxa"/>
+              <w:bottom w:w="65" w:type="dxa"/>
+              <w:right w:w="80" w:type="dxa"/>
+            </w:tcMar>
+          </w:tcPr>
+          <w:p>
+            <w:pPr>
+              <w:spacing w:after="40" w:before="40" w:line="252" w:lineRule="auto"/>
+            </w:pPr>
+            <w:r>
+              <w:rPr>
+                <w:rFonts w:ascii="Arial" w:hAnsi="Arial"/>
+                <w:b w:val="0"/>
+                <w:color w:val="000000"/>
+                <w:sz w:val="18"/>
+              </w:rPr>
+              <w:t>18 July 2023 to 18 June 2024</w:t>
+            </w:r>
+          </w:p>
+        </w:tc>
+        <w:tc>
+          <w:tcPr>
+            <w:tcW w:type="dxa" w:w="2296"/>
+            <w:tcMar>
+              <w:top w:w="65" w:type="dxa"/>
+              <w:left w:w="80" w:type="dxa"/>
+              <w:bottom w:w="65" w:type="dxa"/>
+              <w:right w:w="80" w:type="dxa"/>
+            </w:tcMar>
+          </w:tcPr>
+          <w:p>
+            <w:pPr>
+              <w:spacing w:after="40" w:before="40" w:line="252" w:lineRule="auto"/>
+            </w:pPr>
+            <w:r>
+              <w:rPr>
+                <w:rFonts w:ascii="Arial" w:hAnsi="Arial"/>
+                <w:b w:val="0"/>
+                <w:color w:val="000000"/>
+                <w:sz w:val="18"/>
+              </w:rPr>
+              <w:t>Database access and the restricted correction process</w:t>
+            </w:r>
+          </w:p>
+        </w:tc>
+        <w:tc>
+          <w:tcPr>
+            <w:tcW w:type="dxa" w:w="5017"/>
+            <w:tcMar>
+              <w:top w:w="65" w:type="dxa"/>
+              <w:left w:w="80" w:type="dxa"/>
+              <w:bottom w:w="65" w:type="dxa"/>
+              <w:right w:w="80" w:type="dxa"/>
+            </w:tcMar>
+          </w:tcPr>
+          <w:p>
+            <w:pPr>
+              <w:spacing w:after="40" w:before="40" w:line="252" w:lineRule="auto"/>
+            </w:pPr>
+            <w:r>
+              <w:rPr>
+                <w:rFonts w:ascii="Arial" w:hAnsi="Arial"/>
+                <w:b w:val="0"/>
+                <w:color w:val="000000"/>
+                <w:sz w:val="18"/>
+              </w:rPr>
+              <w:t>Operators lost access; amendments were channelled through specified staff.</w:t>
+            </w:r>
+          </w:p>
+        </w:tc>
+      </w:tr>
+      <w:tr>
+        <w:trPr/>
+        <w:tc>
+          <w:tcPr>
+            <w:tcW w:type="dxa" w:w="652"/>
+            <w:tcMar>
+              <w:top w:w="65" w:type="dxa"/>
+              <w:left w:w="80" w:type="dxa"/>
+              <w:bottom w:w="65" w:type="dxa"/>
+              <w:right w:w="80" w:type="dxa"/>
+            </w:tcMar>
+          </w:tcPr>
+          <w:p>
+            <w:pPr>
+              <w:spacing w:after="40" w:before="40" w:line="252" w:lineRule="auto"/>
+            </w:pPr>
+            <w:r>
+              <w:rPr>
+                <w:rFonts w:ascii="Arial" w:hAnsi="Arial"/>
+                <w:b/>
+                <w:color w:val="000000"/>
+                <w:sz w:val="18"/>
+              </w:rPr>
+              <w:t>1(c)</w:t>
+            </w:r>
+          </w:p>
+        </w:tc>
+        <w:tc>
+          <w:tcPr>
+            <w:tcW w:type="dxa" w:w="1616"/>
+            <w:tcMar>
+              <w:top w:w="65" w:type="dxa"/>
+              <w:left w:w="80" w:type="dxa"/>
+              <w:bottom w:w="65" w:type="dxa"/>
+              <w:right w:w="80" w:type="dxa"/>
+            </w:tcMar>
+          </w:tcPr>
+          <w:p>
+            <w:pPr>
+              <w:spacing w:after="40" w:before="40" w:line="252" w:lineRule="auto"/>
+            </w:pPr>
+            <w:r>
+              <w:rPr>
+                <w:rFonts w:ascii="Arial" w:hAnsi="Arial"/>
+                <w:b w:val="0"/>
+                <w:color w:val="000000"/>
+                <w:sz w:val="18"/>
+              </w:rPr>
+              <w:t>7 August to 16 October 2023</w:t>
+            </w:r>
+          </w:p>
+        </w:tc>
+        <w:tc>
+          <w:tcPr>
+            <w:tcW w:type="dxa" w:w="2296"/>
+            <w:tcMar>
+              <w:top w:w="65" w:type="dxa"/>
+              <w:left w:w="80" w:type="dxa"/>
+              <w:bottom w:w="65" w:type="dxa"/>
+              <w:right w:w="80" w:type="dxa"/>
+            </w:tcMar>
+          </w:tcPr>
+          <w:p>
+            <w:pPr>
+              <w:spacing w:after="40" w:before="40" w:line="252" w:lineRule="auto"/>
+            </w:pPr>
+            <w:r>
+              <w:rPr>
+                <w:rFonts w:ascii="Arial" w:hAnsi="Arial"/>
+                <w:b w:val="0"/>
+                <w:color w:val="000000"/>
+                <w:sz w:val="18"/>
+              </w:rPr>
+              <w:t>Roster concerns and the move to full time</w:t>
+            </w:r>
+          </w:p>
+        </w:tc>
+        <w:tc>
+          <w:tcPr>
+            <w:tcW w:type="dxa" w:w="5017"/>
+            <w:tcMar>
+              <w:top w:w="65" w:type="dxa"/>
+              <w:left w:w="80" w:type="dxa"/>
+              <w:bottom w:w="65" w:type="dxa"/>
+              <w:right w:w="80" w:type="dxa"/>
+            </w:tcMar>
+          </w:tcPr>
+          <w:p>
+            <w:pPr>
+              <w:spacing w:after="40" w:before="40" w:line="252" w:lineRule="auto"/>
+            </w:pPr>
+            <w:r>
+              <w:rPr>
+                <w:rFonts w:ascii="Arial" w:hAnsi="Arial"/>
+                <w:b w:val="0"/>
+                <w:color w:val="000000"/>
+                <w:sz w:val="18"/>
+              </w:rPr>
+              <w:t>Roster error, responses and application for increased hours; context only.</w:t>
+            </w:r>
+          </w:p>
+        </w:tc>
+      </w:tr>
+      <w:tr>
+        <w:trPr/>
+        <w:tc>
+          <w:tcPr>
+            <w:tcW w:type="dxa" w:w="652"/>
+            <w:tcMar>
+              <w:top w:w="65" w:type="dxa"/>
+              <w:left w:w="80" w:type="dxa"/>
+              <w:bottom w:w="65" w:type="dxa"/>
+              <w:right w:w="80" w:type="dxa"/>
+            </w:tcMar>
+          </w:tcPr>
+          <w:p>
+            <w:pPr>
+              <w:spacing w:after="40" w:before="40" w:line="252" w:lineRule="auto"/>
+            </w:pPr>
+            <w:r>
+              <w:rPr>
+                <w:rFonts w:ascii="Arial" w:hAnsi="Arial"/>
+                <w:b/>
+                <w:color w:val="000000"/>
+                <w:sz w:val="18"/>
+              </w:rPr>
+              <w:t>1(d)</w:t>
+            </w:r>
+          </w:p>
+        </w:tc>
+        <w:tc>
+          <w:tcPr>
+            <w:tcW w:type="dxa" w:w="1616"/>
+            <w:tcMar>
+              <w:top w:w="65" w:type="dxa"/>
+              <w:left w:w="80" w:type="dxa"/>
+              <w:bottom w:w="65" w:type="dxa"/>
+              <w:right w:w="80" w:type="dxa"/>
+            </w:tcMar>
+          </w:tcPr>
+          <w:p>
+            <w:pPr>
+              <w:spacing w:after="40" w:before="40" w:line="252" w:lineRule="auto"/>
+            </w:pPr>
+            <w:r>
+              <w:rPr>
+                <w:rFonts w:ascii="Arial" w:hAnsi="Arial"/>
+                <w:b w:val="0"/>
+                <w:color w:val="000000"/>
+                <w:sz w:val="18"/>
+              </w:rPr>
+              <w:t>23 August 2023 to 17 May 2024</w:t>
+            </w:r>
+          </w:p>
+        </w:tc>
+        <w:tc>
+          <w:tcPr>
+            <w:tcW w:type="dxa" w:w="2296"/>
+            <w:tcMar>
+              <w:top w:w="65" w:type="dxa"/>
+              <w:left w:w="80" w:type="dxa"/>
+              <w:bottom w:w="65" w:type="dxa"/>
+              <w:right w:w="80" w:type="dxa"/>
+            </w:tcMar>
+          </w:tcPr>
+          <w:p>
+            <w:pPr>
+              <w:spacing w:after="40" w:before="40" w:line="252" w:lineRule="auto"/>
+            </w:pPr>
+            <w:r>
+              <w:rPr>
+                <w:rFonts w:ascii="Arial" w:hAnsi="Arial"/>
+                <w:b w:val="0"/>
+                <w:color w:val="000000"/>
+                <w:sz w:val="18"/>
+              </w:rPr>
+              <w:t>Notification of variable office hours</w:t>
+            </w:r>
+          </w:p>
+        </w:tc>
+        <w:tc>
+          <w:tcPr>
+            <w:tcW w:type="dxa" w:w="5017"/>
+            <w:tcMar>
+              <w:top w:w="65" w:type="dxa"/>
+              <w:left w:w="80" w:type="dxa"/>
+              <w:bottom w:w="65" w:type="dxa"/>
+              <w:right w:w="80" w:type="dxa"/>
+            </w:tcMar>
+          </w:tcPr>
+          <w:p>
+            <w:pPr>
+              <w:spacing w:after="40" w:before="40" w:line="252" w:lineRule="auto"/>
+            </w:pPr>
+            <w:r>
+              <w:rPr>
+                <w:rFonts w:ascii="Arial" w:hAnsi="Arial"/>
+                <w:b w:val="0"/>
+                <w:color w:val="000000"/>
+                <w:sz w:val="18"/>
+              </w:rPr>
+              <w:t>Variable hours were stated; no intervening statement of fixed hours is alleged.</w:t>
+            </w:r>
+          </w:p>
+        </w:tc>
+      </w:tr>
+      <w:tr>
+        <w:trPr/>
+        <w:tc>
+          <w:tcPr>
+            <w:tcW w:type="dxa" w:w="652"/>
+            <w:tcMar>
+              <w:top w:w="65" w:type="dxa"/>
+              <w:left w:w="80" w:type="dxa"/>
+              <w:bottom w:w="65" w:type="dxa"/>
+              <w:right w:w="80" w:type="dxa"/>
+            </w:tcMar>
+          </w:tcPr>
+          <w:p>
+            <w:pPr>
+              <w:spacing w:after="40" w:before="40" w:line="252" w:lineRule="auto"/>
+            </w:pPr>
+            <w:r>
+              <w:rPr>
+                <w:rFonts w:ascii="Arial" w:hAnsi="Arial"/>
+                <w:b/>
+                <w:color w:val="000000"/>
+                <w:sz w:val="18"/>
+              </w:rPr>
+              <w:t>1(e)</w:t>
+            </w:r>
+          </w:p>
+        </w:tc>
+        <w:tc>
+          <w:tcPr>
+            <w:tcW w:type="dxa" w:w="1616"/>
+            <w:tcMar>
+              <w:top w:w="65" w:type="dxa"/>
+              <w:left w:w="80" w:type="dxa"/>
+              <w:bottom w:w="65" w:type="dxa"/>
+              <w:right w:w="80" w:type="dxa"/>
+            </w:tcMar>
+          </w:tcPr>
+          <w:p>
+            <w:pPr>
+              <w:spacing w:after="40" w:before="40" w:line="252" w:lineRule="auto"/>
+            </w:pPr>
+            <w:r>
+              <w:rPr>
+                <w:rFonts w:ascii="Arial" w:hAnsi="Arial"/>
+                <w:b w:val="0"/>
+                <w:color w:val="000000"/>
+                <w:sz w:val="18"/>
+              </w:rPr>
+              <w:t>20 February to 1 March 2024</w:t>
+            </w:r>
+          </w:p>
+        </w:tc>
+        <w:tc>
+          <w:tcPr>
+            <w:tcW w:type="dxa" w:w="2296"/>
+            <w:tcMar>
+              <w:top w:w="65" w:type="dxa"/>
+              <w:left w:w="80" w:type="dxa"/>
+              <w:bottom w:w="65" w:type="dxa"/>
+              <w:right w:w="80" w:type="dxa"/>
+            </w:tcMar>
+          </w:tcPr>
+          <w:p>
+            <w:pPr>
+              <w:spacing w:after="40" w:before="40" w:line="252" w:lineRule="auto"/>
+            </w:pPr>
+            <w:r>
+              <w:rPr>
+                <w:rFonts w:ascii="Arial" w:hAnsi="Arial"/>
+                <w:b w:val="0"/>
+                <w:color w:val="000000"/>
+                <w:sz w:val="18"/>
+              </w:rPr>
+              <w:t>Pandemic leave submissions</w:t>
+            </w:r>
+          </w:p>
+        </w:tc>
+        <w:tc>
+          <w:tcPr>
+            <w:tcW w:type="dxa" w:w="5017"/>
+            <w:tcMar>
+              <w:top w:w="65" w:type="dxa"/>
+              <w:left w:w="80" w:type="dxa"/>
+              <w:bottom w:w="65" w:type="dxa"/>
+              <w:right w:w="80" w:type="dxa"/>
+            </w:tcMar>
+          </w:tcPr>
+          <w:p>
+            <w:pPr>
+              <w:spacing w:after="40" w:before="40" w:line="252" w:lineRule="auto"/>
+            </w:pPr>
+            <w:r>
+              <w:rPr>
+                <w:rFonts w:ascii="Arial" w:hAnsi="Arial"/>
+                <w:b w:val="0"/>
+                <w:color w:val="000000"/>
+                <w:sz w:val="18"/>
+              </w:rPr>
+              <w:t>Two declines and three submissions; context here and entitlement issue in 2(b).</w:t>
+            </w:r>
+          </w:p>
+        </w:tc>
+      </w:tr>
+      <w:tr>
+        <w:trPr/>
+        <w:tc>
+          <w:tcPr>
+            <w:tcW w:type="dxa" w:w="652"/>
+            <w:tcMar>
+              <w:top w:w="65" w:type="dxa"/>
+              <w:left w:w="80" w:type="dxa"/>
+              <w:bottom w:w="65" w:type="dxa"/>
+              <w:right w:w="80" w:type="dxa"/>
+            </w:tcMar>
+          </w:tcPr>
+          <w:p>
+            <w:pPr>
+              <w:spacing w:after="40" w:before="40" w:line="252" w:lineRule="auto"/>
+            </w:pPr>
+            <w:r>
+              <w:rPr>
+                <w:rFonts w:ascii="Arial" w:hAnsi="Arial"/>
+                <w:b/>
+                <w:color w:val="000000"/>
+                <w:sz w:val="18"/>
+              </w:rPr>
+              <w:t>1(f)</w:t>
+            </w:r>
+          </w:p>
+        </w:tc>
+        <w:tc>
+          <w:tcPr>
+            <w:tcW w:type="dxa" w:w="1616"/>
+            <w:tcMar>
+              <w:top w:w="65" w:type="dxa"/>
+              <w:left w:w="80" w:type="dxa"/>
+              <w:bottom w:w="65" w:type="dxa"/>
+              <w:right w:w="80" w:type="dxa"/>
+            </w:tcMar>
+          </w:tcPr>
+          <w:p>
+            <w:pPr>
+              <w:spacing w:after="40" w:before="40" w:line="252" w:lineRule="auto"/>
+            </w:pPr>
+            <w:r>
+              <w:rPr>
+                <w:rFonts w:ascii="Arial" w:hAnsi="Arial"/>
+                <w:b w:val="0"/>
+                <w:color w:val="000000"/>
+                <w:sz w:val="18"/>
+              </w:rPr>
+              <w:t>15 April 2024</w:t>
+            </w:r>
+          </w:p>
+        </w:tc>
+        <w:tc>
+          <w:tcPr>
+            <w:tcW w:type="dxa" w:w="2296"/>
+            <w:tcMar>
+              <w:top w:w="65" w:type="dxa"/>
+              <w:left w:w="80" w:type="dxa"/>
+              <w:bottom w:w="65" w:type="dxa"/>
+              <w:right w:w="80" w:type="dxa"/>
+            </w:tcMar>
+          </w:tcPr>
+          <w:p>
+            <w:pPr>
+              <w:spacing w:after="40" w:before="40" w:line="252" w:lineRule="auto"/>
+            </w:pPr>
+            <w:r>
+              <w:rPr>
+                <w:rFonts w:ascii="Arial" w:hAnsi="Arial"/>
+                <w:b w:val="0"/>
+                <w:color w:val="000000"/>
+                <w:sz w:val="18"/>
+              </w:rPr>
+              <w:t>After hours on call process changed</w:t>
+            </w:r>
+          </w:p>
+        </w:tc>
+        <w:tc>
+          <w:tcPr>
+            <w:tcW w:type="dxa" w:w="5017"/>
+            <w:tcMar>
+              <w:top w:w="65" w:type="dxa"/>
+              <w:left w:w="80" w:type="dxa"/>
+              <w:bottom w:w="65" w:type="dxa"/>
+              <w:right w:w="80" w:type="dxa"/>
+            </w:tcMar>
+          </w:tcPr>
+          <w:p>
+            <w:pPr>
+              <w:spacing w:after="40" w:before="40" w:line="252" w:lineRule="auto"/>
+            </w:pPr>
+            <w:r>
+              <w:rPr>
+                <w:rFonts w:ascii="Arial" w:hAnsi="Arial"/>
+                <w:b w:val="0"/>
+                <w:color w:val="000000"/>
+                <w:sz w:val="18"/>
+              </w:rPr>
+              <w:t>New process was stated to take effect that day.</w:t>
+            </w:r>
+          </w:p>
+        </w:tc>
+      </w:tr>
+      <w:tr>
+        <w:trPr/>
+        <w:tc>
+          <w:tcPr>
+            <w:tcW w:type="dxa" w:w="652"/>
+            <w:tcMar>
+              <w:top w:w="65" w:type="dxa"/>
+              <w:left w:w="80" w:type="dxa"/>
+              <w:bottom w:w="65" w:type="dxa"/>
+              <w:right w:w="80" w:type="dxa"/>
+            </w:tcMar>
+          </w:tcPr>
+          <w:p>
+            <w:pPr>
+              <w:spacing w:after="40" w:before="40" w:line="252" w:lineRule="auto"/>
+            </w:pPr>
+            <w:r>
+              <w:rPr>
+                <w:rFonts w:ascii="Arial" w:hAnsi="Arial"/>
+                <w:b/>
+                <w:color w:val="000000"/>
+                <w:sz w:val="18"/>
+              </w:rPr>
+              <w:t>1(g)</w:t>
+            </w:r>
+          </w:p>
+        </w:tc>
+        <w:tc>
+          <w:tcPr>
+            <w:tcW w:type="dxa" w:w="1616"/>
+            <w:tcMar>
+              <w:top w:w="65" w:type="dxa"/>
+              <w:left w:w="80" w:type="dxa"/>
+              <w:bottom w:w="65" w:type="dxa"/>
+              <w:right w:w="80" w:type="dxa"/>
+            </w:tcMar>
+          </w:tcPr>
+          <w:p>
+            <w:pPr>
+              <w:spacing w:after="40" w:before="40" w:line="252" w:lineRule="auto"/>
+            </w:pPr>
+            <w:r>
+              <w:rPr>
+                <w:rFonts w:ascii="Arial" w:hAnsi="Arial"/>
+                <w:b w:val="0"/>
+                <w:color w:val="000000"/>
+                <w:sz w:val="18"/>
+              </w:rPr>
+              <w:t>19 April 2024</w:t>
+            </w:r>
+          </w:p>
+        </w:tc>
+        <w:tc>
+          <w:tcPr>
+            <w:tcW w:type="dxa" w:w="2296"/>
+            <w:tcMar>
+              <w:top w:w="65" w:type="dxa"/>
+              <w:left w:w="80" w:type="dxa"/>
+              <w:bottom w:w="65" w:type="dxa"/>
+              <w:right w:w="80" w:type="dxa"/>
+            </w:tcMar>
+          </w:tcPr>
+          <w:p>
+            <w:pPr>
+              <w:spacing w:after="40" w:before="40" w:line="252" w:lineRule="auto"/>
+            </w:pPr>
+            <w:r>
+              <w:rPr>
+                <w:rFonts w:ascii="Arial" w:hAnsi="Arial"/>
+                <w:b w:val="0"/>
+                <w:color w:val="000000"/>
+                <w:sz w:val="18"/>
+              </w:rPr>
+              <w:t>Data entry process changed</w:t>
+            </w:r>
+          </w:p>
+        </w:tc>
+        <w:tc>
+          <w:tcPr>
+            <w:tcW w:type="dxa" w:w="5017"/>
+            <w:tcMar>
+              <w:top w:w="65" w:type="dxa"/>
+              <w:left w:w="80" w:type="dxa"/>
+              <w:bottom w:w="65" w:type="dxa"/>
+              <w:right w:w="80" w:type="dxa"/>
+            </w:tcMar>
+          </w:tcPr>
+          <w:p>
+            <w:pPr>
+              <w:spacing w:after="40" w:before="40" w:line="252" w:lineRule="auto"/>
+            </w:pPr>
+            <w:r>
+              <w:rPr>
+                <w:rFonts w:ascii="Arial" w:hAnsi="Arial"/>
+                <w:b w:val="0"/>
+                <w:color w:val="000000"/>
+                <w:sz w:val="18"/>
+              </w:rPr>
+              <w:t>The review decision records a new checking process following data entry errors.</w:t>
+            </w:r>
+          </w:p>
+        </w:tc>
+      </w:tr>
+      <w:tr>
+        <w:trPr/>
+        <w:tc>
+          <w:tcPr>
+            <w:tcW w:type="dxa" w:w="652"/>
+            <w:tcMar>
+              <w:top w:w="65" w:type="dxa"/>
+              <w:left w:w="80" w:type="dxa"/>
+              <w:bottom w:w="65" w:type="dxa"/>
+              <w:right w:w="80" w:type="dxa"/>
+            </w:tcMar>
+          </w:tcPr>
+          <w:p>
+            <w:pPr>
+              <w:spacing w:after="40" w:before="40" w:line="252" w:lineRule="auto"/>
+            </w:pPr>
+            <w:r>
+              <w:rPr>
+                <w:rFonts w:ascii="Arial" w:hAnsi="Arial"/>
+                <w:b/>
+                <w:color w:val="000000"/>
+                <w:sz w:val="18"/>
+              </w:rPr>
+              <w:t>1(h)</w:t>
+            </w:r>
+          </w:p>
+        </w:tc>
+        <w:tc>
+          <w:tcPr>
+            <w:tcW w:type="dxa" w:w="1616"/>
+            <w:tcMar>
+              <w:top w:w="65" w:type="dxa"/>
+              <w:left w:w="80" w:type="dxa"/>
+              <w:bottom w:w="65" w:type="dxa"/>
+              <w:right w:w="80" w:type="dxa"/>
+            </w:tcMar>
+          </w:tcPr>
+          <w:p>
+            <w:pPr>
+              <w:spacing w:after="40" w:before="40" w:line="252" w:lineRule="auto"/>
+            </w:pPr>
+            <w:r>
+              <w:rPr>
+                <w:rFonts w:ascii="Arial" w:hAnsi="Arial"/>
+                <w:b w:val="0"/>
+                <w:color w:val="000000"/>
+                <w:sz w:val="18"/>
+              </w:rPr>
+              <w:t>2 to 9 May 2024</w:t>
+            </w:r>
+          </w:p>
+        </w:tc>
+        <w:tc>
+          <w:tcPr>
+            <w:tcW w:type="dxa" w:w="2296"/>
+            <w:tcMar>
+              <w:top w:w="65" w:type="dxa"/>
+              <w:left w:w="80" w:type="dxa"/>
+              <w:bottom w:w="65" w:type="dxa"/>
+              <w:right w:w="80" w:type="dxa"/>
+            </w:tcMar>
+          </w:tcPr>
+          <w:p>
+            <w:pPr>
+              <w:spacing w:after="40" w:before="40" w:line="252" w:lineRule="auto"/>
+            </w:pPr>
+            <w:r>
+              <w:rPr>
+                <w:rFonts w:ascii="Arial" w:hAnsi="Arial"/>
+                <w:b w:val="0"/>
+                <w:color w:val="000000"/>
+                <w:sz w:val="18"/>
+              </w:rPr>
+              <w:t>Misdirected calls and the MASPER response</w:t>
+            </w:r>
+          </w:p>
+        </w:tc>
+        <w:tc>
+          <w:tcPr>
+            <w:tcW w:type="dxa" w:w="5017"/>
+            <w:tcMar>
+              <w:top w:w="65" w:type="dxa"/>
+              <w:left w:w="80" w:type="dxa"/>
+              <w:bottom w:w="65" w:type="dxa"/>
+              <w:right w:w="80" w:type="dxa"/>
+            </w:tcMar>
+          </w:tcPr>
+          <w:p>
+            <w:pPr>
+              <w:spacing w:after="40" w:before="40" w:line="252" w:lineRule="auto"/>
+            </w:pPr>
+            <w:r>
+              <w:rPr>
+                <w:rFonts w:ascii="Arial" w:hAnsi="Arial"/>
+                <w:b w:val="0"/>
+                <w:color w:val="000000"/>
+                <w:sz w:val="18"/>
+              </w:rPr>
+              <w:t>Two reports recorded nine occasions before a revised process was communicated.</w:t>
+            </w:r>
+          </w:p>
+        </w:tc>
+      </w:tr>
+      <w:tr>
+        <w:trPr/>
+        <w:tc>
+          <w:tcPr>
+            <w:tcW w:type="dxa" w:w="652"/>
+            <w:tcMar>
+              <w:top w:w="65" w:type="dxa"/>
+              <w:left w:w="80" w:type="dxa"/>
+              <w:bottom w:w="65" w:type="dxa"/>
+              <w:right w:w="80" w:type="dxa"/>
+            </w:tcMar>
+          </w:tcPr>
+          <w:p>
+            <w:pPr>
+              <w:spacing w:after="40" w:before="40" w:line="252" w:lineRule="auto"/>
+            </w:pPr>
+            <w:r>
+              <w:rPr>
+                <w:rFonts w:ascii="Arial" w:hAnsi="Arial"/>
+                <w:b/>
+                <w:color w:val="000000"/>
+                <w:sz w:val="18"/>
+              </w:rPr>
+              <w:t>1(i)</w:t>
+            </w:r>
+          </w:p>
+        </w:tc>
+        <w:tc>
+          <w:tcPr>
+            <w:tcW w:type="dxa" w:w="1616"/>
+            <w:tcMar>
+              <w:top w:w="65" w:type="dxa"/>
+              <w:left w:w="80" w:type="dxa"/>
+              <w:bottom w:w="65" w:type="dxa"/>
+              <w:right w:w="80" w:type="dxa"/>
+            </w:tcMar>
+          </w:tcPr>
+          <w:p>
+            <w:pPr>
+              <w:spacing w:after="40" w:before="40" w:line="252" w:lineRule="auto"/>
+            </w:pPr>
+            <w:r>
+              <w:rPr>
+                <w:rFonts w:ascii="Arial" w:hAnsi="Arial"/>
+                <w:b w:val="0"/>
+                <w:color w:val="000000"/>
+                <w:sz w:val="18"/>
+              </w:rPr>
+              <w:t>13 to 21 May 2024</w:t>
+            </w:r>
+          </w:p>
+        </w:tc>
+        <w:tc>
+          <w:tcPr>
+            <w:tcW w:type="dxa" w:w="2296"/>
+            <w:tcMar>
+              <w:top w:w="65" w:type="dxa"/>
+              <w:left w:w="80" w:type="dxa"/>
+              <w:bottom w:w="65" w:type="dxa"/>
+              <w:right w:w="80" w:type="dxa"/>
+            </w:tcMar>
+          </w:tcPr>
+          <w:p>
+            <w:pPr>
+              <w:spacing w:after="40" w:before="40" w:line="252" w:lineRule="auto"/>
+            </w:pPr>
+            <w:r>
+              <w:rPr>
+                <w:rFonts w:ascii="Arial" w:hAnsi="Arial"/>
+                <w:b w:val="0"/>
+                <w:color w:val="000000"/>
+                <w:sz w:val="18"/>
+              </w:rPr>
+              <w:t>The complaint of 13 May 2024, and the days that followed</w:t>
+            </w:r>
+          </w:p>
+        </w:tc>
+        <w:tc>
+          <w:tcPr>
+            <w:tcW w:type="dxa" w:w="5017"/>
+            <w:tcMar>
+              <w:top w:w="65" w:type="dxa"/>
+              <w:left w:w="80" w:type="dxa"/>
+              <w:bottom w:w="65" w:type="dxa"/>
+              <w:right w:w="80" w:type="dxa"/>
+            </w:tcMar>
+          </w:tcPr>
+          <w:p>
+            <w:pPr>
+              <w:spacing w:after="40" w:before="40" w:line="252" w:lineRule="auto"/>
+            </w:pPr>
+            <w:r>
+              <w:rPr>
+                <w:rFonts w:ascii="Arial" w:hAnsi="Arial"/>
+                <w:b w:val="0"/>
+                <w:color w:val="000000"/>
+                <w:sz w:val="18"/>
+              </w:rPr>
+              <w:t>Complaint and distribution chronology; context only, with no separate causal allegation.</w:t>
+            </w:r>
+          </w:p>
+        </w:tc>
+      </w:tr>
+      <w:tr>
+        <w:trPr/>
+        <w:tc>
+          <w:tcPr>
+            <w:tcW w:type="dxa" w:w="652"/>
+            <w:tcMar>
+              <w:top w:w="65" w:type="dxa"/>
+              <w:left w:w="80" w:type="dxa"/>
+              <w:bottom w:w="65" w:type="dxa"/>
+              <w:right w:w="80" w:type="dxa"/>
+            </w:tcMar>
+          </w:tcPr>
+          <w:p>
+            <w:pPr>
+              <w:spacing w:after="40" w:before="40" w:line="252" w:lineRule="auto"/>
+            </w:pPr>
+            <w:r>
+              <w:rPr>
+                <w:rFonts w:ascii="Arial" w:hAnsi="Arial"/>
+                <w:b/>
+                <w:color w:val="000000"/>
+                <w:sz w:val="18"/>
+              </w:rPr>
+              <w:t>1(j)</w:t>
+            </w:r>
+          </w:p>
+        </w:tc>
+        <w:tc>
+          <w:tcPr>
+            <w:tcW w:type="dxa" w:w="1616"/>
+            <w:tcMar>
+              <w:top w:w="65" w:type="dxa"/>
+              <w:left w:w="80" w:type="dxa"/>
+              <w:bottom w:w="65" w:type="dxa"/>
+              <w:right w:w="80" w:type="dxa"/>
+            </w:tcMar>
+          </w:tcPr>
+          <w:p>
+            <w:pPr>
+              <w:spacing w:after="40" w:before="40" w:line="252" w:lineRule="auto"/>
+            </w:pPr>
+            <w:r>
+              <w:rPr>
+                <w:rFonts w:ascii="Arial" w:hAnsi="Arial"/>
+                <w:b w:val="0"/>
+                <w:color w:val="000000"/>
+                <w:sz w:val="18"/>
+              </w:rPr>
+              <w:t>13 to 15 May 2024</w:t>
+            </w:r>
+          </w:p>
+        </w:tc>
+        <w:tc>
+          <w:tcPr>
+            <w:tcW w:type="dxa" w:w="2296"/>
+            <w:tcMar>
+              <w:top w:w="65" w:type="dxa"/>
+              <w:left w:w="80" w:type="dxa"/>
+              <w:bottom w:w="65" w:type="dxa"/>
+              <w:right w:w="80" w:type="dxa"/>
+            </w:tcMar>
+          </w:tcPr>
+          <w:p>
+            <w:pPr>
+              <w:spacing w:after="40" w:before="40" w:line="252" w:lineRule="auto"/>
+            </w:pPr>
+            <w:r>
+              <w:rPr>
+                <w:rFonts w:ascii="Arial" w:hAnsi="Arial"/>
+                <w:b w:val="0"/>
+                <w:color w:val="000000"/>
+                <w:sz w:val="18"/>
+              </w:rPr>
+              <w:t>On-call roster and absence notification instructions</w:t>
+            </w:r>
+          </w:p>
+        </w:tc>
+        <w:tc>
+          <w:tcPr>
+            <w:tcW w:type="dxa" w:w="5017"/>
+            <w:tcMar>
+              <w:top w:w="65" w:type="dxa"/>
+              <w:left w:w="80" w:type="dxa"/>
+              <w:bottom w:w="65" w:type="dxa"/>
+              <w:right w:w="80" w:type="dxa"/>
+            </w:tcMar>
+          </w:tcPr>
+          <w:p>
+            <w:pPr>
+              <w:spacing w:after="40" w:before="40" w:line="252" w:lineRule="auto"/>
+            </w:pPr>
+            <w:r>
+              <w:rPr>
+                <w:rFonts w:ascii="Arial" w:hAnsi="Arial"/>
+                <w:b w:val="0"/>
+                <w:color w:val="000000"/>
+                <w:sz w:val="18"/>
+              </w:rPr>
+              <w:t>Roster circulated on the first day of the fortnight it covered; notification of unavailability channelled through the manager from 14 May; context only.</w:t>
+            </w:r>
+          </w:p>
+        </w:tc>
+      </w:tr>
+      <w:tr>
+        <w:trPr/>
+        <w:tc>
+          <w:tcPr>
+            <w:tcW w:type="dxa" w:w="652"/>
+            <w:tcMar>
+              <w:top w:w="65" w:type="dxa"/>
+              <w:left w:w="80" w:type="dxa"/>
+              <w:bottom w:w="65" w:type="dxa"/>
+              <w:right w:w="80" w:type="dxa"/>
+            </w:tcMar>
+          </w:tcPr>
+          <w:p>
+            <w:pPr>
+              <w:spacing w:after="40" w:before="40" w:line="252" w:lineRule="auto"/>
+            </w:pPr>
+            <w:r>
+              <w:rPr>
+                <w:rFonts w:ascii="Arial" w:hAnsi="Arial"/>
+                <w:b/>
+                <w:color w:val="000000"/>
+                <w:sz w:val="18"/>
+              </w:rPr>
+              <w:t>1(k)</w:t>
+            </w:r>
+          </w:p>
+        </w:tc>
+        <w:tc>
+          <w:tcPr>
+            <w:tcW w:type="dxa" w:w="1616"/>
+            <w:tcMar>
+              <w:top w:w="65" w:type="dxa"/>
+              <w:left w:w="80" w:type="dxa"/>
+              <w:bottom w:w="65" w:type="dxa"/>
+              <w:right w:w="80" w:type="dxa"/>
+            </w:tcMar>
+          </w:tcPr>
+          <w:p>
+            <w:pPr>
+              <w:spacing w:after="40" w:before="40" w:line="252" w:lineRule="auto"/>
+            </w:pPr>
+            <w:r>
+              <w:rPr>
+                <w:rFonts w:ascii="Arial" w:hAnsi="Arial"/>
+                <w:b w:val="0"/>
+                <w:color w:val="000000"/>
+                <w:sz w:val="18"/>
+              </w:rPr>
+              <w:t>15 to 20 May 2024</w:t>
+            </w:r>
+          </w:p>
+        </w:tc>
+        <w:tc>
+          <w:tcPr>
+            <w:tcW w:type="dxa" w:w="2296"/>
+            <w:tcMar>
+              <w:top w:w="65" w:type="dxa"/>
+              <w:left w:w="80" w:type="dxa"/>
+              <w:bottom w:w="65" w:type="dxa"/>
+              <w:right w:w="80" w:type="dxa"/>
+            </w:tcMar>
+          </w:tcPr>
+          <w:p>
+            <w:pPr>
+              <w:spacing w:after="40" w:before="40" w:line="252" w:lineRule="auto"/>
+            </w:pPr>
+            <w:r>
+              <w:rPr>
+                <w:rFonts w:ascii="Arial" w:hAnsi="Arial"/>
+                <w:b w:val="0"/>
+                <w:color w:val="000000"/>
+                <w:sz w:val="18"/>
+              </w:rPr>
+              <w:t>Respiratory directory error and requests for correction</w:t>
+            </w:r>
+          </w:p>
+        </w:tc>
+        <w:tc>
+          <w:tcPr>
+            <w:tcW w:type="dxa" w:w="5017"/>
+            <w:tcMar>
+              <w:top w:w="65" w:type="dxa"/>
+              <w:left w:w="80" w:type="dxa"/>
+              <w:bottom w:w="65" w:type="dxa"/>
+              <w:right w:w="80" w:type="dxa"/>
+            </w:tcMar>
+          </w:tcPr>
+          <w:p>
+            <w:pPr>
+              <w:spacing w:after="40" w:before="40" w:line="252" w:lineRule="auto"/>
+            </w:pPr>
+            <w:r>
+              <w:rPr>
+                <w:rFonts w:ascii="Arial" w:hAnsi="Arial"/>
+                <w:b w:val="0"/>
+                <w:color w:val="000000"/>
+                <w:sz w:val="18"/>
+              </w:rPr>
+              <w:t>Repeated requests, the Appellant’s escalation and management reply.</w:t>
+            </w:r>
+          </w:p>
+        </w:tc>
+      </w:tr>
+      <w:tr>
+        <w:trPr/>
+        <w:tc>
+          <w:tcPr>
+            <w:tcW w:type="dxa" w:w="652"/>
+            <w:tcMar>
+              <w:top w:w="65" w:type="dxa"/>
+              <w:left w:w="80" w:type="dxa"/>
+              <w:bottom w:w="65" w:type="dxa"/>
+              <w:right w:w="80" w:type="dxa"/>
+            </w:tcMar>
+          </w:tcPr>
+          <w:p>
+            <w:pPr>
+              <w:spacing w:after="40" w:before="40" w:line="252" w:lineRule="auto"/>
+            </w:pPr>
+            <w:r>
+              <w:rPr>
+                <w:rFonts w:ascii="Arial" w:hAnsi="Arial"/>
+                <w:b/>
+                <w:color w:val="000000"/>
+                <w:sz w:val="18"/>
+              </w:rPr>
+              <w:t>1(l)</w:t>
+            </w:r>
+          </w:p>
+        </w:tc>
+        <w:tc>
+          <w:tcPr>
+            <w:tcW w:type="dxa" w:w="1616"/>
+            <w:tcMar>
+              <w:top w:w="65" w:type="dxa"/>
+              <w:left w:w="80" w:type="dxa"/>
+              <w:bottom w:w="65" w:type="dxa"/>
+              <w:right w:w="80" w:type="dxa"/>
+            </w:tcMar>
+          </w:tcPr>
+          <w:p>
+            <w:pPr>
+              <w:spacing w:after="40" w:before="40" w:line="252" w:lineRule="auto"/>
+            </w:pPr>
+            <w:r>
+              <w:rPr>
+                <w:rFonts w:ascii="Arial" w:hAnsi="Arial"/>
+                <w:b w:val="0"/>
+                <w:color w:val="000000"/>
+                <w:sz w:val="18"/>
+              </w:rPr>
+              <w:t>15 to 21 May 2024</w:t>
+            </w:r>
+          </w:p>
+        </w:tc>
+        <w:tc>
+          <w:tcPr>
+            <w:tcW w:type="dxa" w:w="2296"/>
+            <w:tcMar>
+              <w:top w:w="65" w:type="dxa"/>
+              <w:left w:w="80" w:type="dxa"/>
+              <w:bottom w:w="65" w:type="dxa"/>
+              <w:right w:w="80" w:type="dxa"/>
+            </w:tcMar>
+          </w:tcPr>
+          <w:p>
+            <w:pPr>
+              <w:spacing w:after="40" w:before="40" w:line="252" w:lineRule="auto"/>
+            </w:pPr>
+            <w:r>
+              <w:rPr>
+                <w:rFonts w:ascii="Arial" w:hAnsi="Arial"/>
+                <w:b w:val="0"/>
+                <w:color w:val="000000"/>
+                <w:sz w:val="18"/>
+              </w:rPr>
+              <w:t>Office hours request and the retraction response</w:t>
+            </w:r>
+          </w:p>
+        </w:tc>
+        <w:tc>
+          <w:tcPr>
+            <w:tcW w:type="dxa" w:w="5017"/>
+            <w:tcMar>
+              <w:top w:w="65" w:type="dxa"/>
+              <w:left w:w="80" w:type="dxa"/>
+              <w:bottom w:w="65" w:type="dxa"/>
+              <w:right w:w="80" w:type="dxa"/>
+            </w:tcMar>
+          </w:tcPr>
+          <w:p>
+            <w:pPr>
+              <w:spacing w:after="40" w:before="40" w:line="252" w:lineRule="auto"/>
+            </w:pPr>
+            <w:r>
+              <w:rPr>
+                <w:rFonts w:ascii="Arial" w:hAnsi="Arial"/>
+                <w:b w:val="0"/>
+                <w:color w:val="000000"/>
+                <w:sz w:val="18"/>
+              </w:rPr>
+              <w:t>Request for clarity, retraction request, hours clarification and follow-up.</w:t>
+            </w:r>
+          </w:p>
+        </w:tc>
+      </w:tr>
+      <w:tr>
+        <w:trPr/>
+        <w:tc>
+          <w:tcPr>
+            <w:tcW w:type="dxa" w:w="652"/>
+            <w:tcMar>
+              <w:top w:w="65" w:type="dxa"/>
+              <w:left w:w="80" w:type="dxa"/>
+              <w:bottom w:w="65" w:type="dxa"/>
+              <w:right w:w="80" w:type="dxa"/>
+            </w:tcMar>
+          </w:tcPr>
+          <w:p>
+            <w:pPr>
+              <w:spacing w:after="40" w:before="40" w:line="252" w:lineRule="auto"/>
+            </w:pPr>
+            <w:r>
+              <w:rPr>
+                <w:rFonts w:ascii="Arial" w:hAnsi="Arial"/>
+                <w:b/>
+                <w:color w:val="000000"/>
+                <w:sz w:val="18"/>
+              </w:rPr>
+              <w:t>2(a)</w:t>
+            </w:r>
+          </w:p>
+        </w:tc>
+        <w:tc>
+          <w:tcPr>
+            <w:tcW w:type="dxa" w:w="1616"/>
+            <w:tcMar>
+              <w:top w:w="65" w:type="dxa"/>
+              <w:left w:w="80" w:type="dxa"/>
+              <w:bottom w:w="65" w:type="dxa"/>
+              <w:right w:w="80" w:type="dxa"/>
+            </w:tcMar>
+          </w:tcPr>
+          <w:p>
+            <w:pPr>
+              <w:spacing w:after="40" w:before="40" w:line="252" w:lineRule="auto"/>
+            </w:pPr>
+            <w:r>
+              <w:rPr>
+                <w:rFonts w:ascii="Arial" w:hAnsi="Arial"/>
+                <w:b w:val="0"/>
+                <w:color w:val="000000"/>
+                <w:sz w:val="18"/>
+              </w:rPr>
+              <w:t>9 February 2024</w:t>
+            </w:r>
+          </w:p>
+        </w:tc>
+        <w:tc>
+          <w:tcPr>
+            <w:tcW w:type="dxa" w:w="2296"/>
+            <w:tcMar>
+              <w:top w:w="65" w:type="dxa"/>
+              <w:left w:w="80" w:type="dxa"/>
+              <w:bottom w:w="65" w:type="dxa"/>
+              <w:right w:w="80" w:type="dxa"/>
+            </w:tcMar>
+          </w:tcPr>
+          <w:p>
+            <w:pPr>
+              <w:spacing w:after="40" w:before="40" w:line="252" w:lineRule="auto"/>
+            </w:pPr>
+            <w:r>
+              <w:rPr>
+                <w:rFonts w:ascii="Arial" w:hAnsi="Arial"/>
+                <w:b w:val="0"/>
+                <w:color w:val="000000"/>
+                <w:sz w:val="18"/>
+              </w:rPr>
+              <w:t>Seven hours recorded instead of eight</w:t>
+            </w:r>
+          </w:p>
+        </w:tc>
+        <w:tc>
+          <w:tcPr>
+            <w:tcW w:type="dxa" w:w="5017"/>
+            <w:tcMar>
+              <w:top w:w="65" w:type="dxa"/>
+              <w:left w:w="80" w:type="dxa"/>
+              <w:bottom w:w="65" w:type="dxa"/>
+              <w:right w:w="80" w:type="dxa"/>
+            </w:tcMar>
+          </w:tcPr>
+          <w:p>
+            <w:pPr>
+              <w:spacing w:after="40" w:before="40" w:line="252" w:lineRule="auto"/>
+            </w:pPr>
+            <w:r>
+              <w:rPr>
+                <w:rFonts w:ascii="Arial" w:hAnsi="Arial"/>
+                <w:b w:val="0"/>
+                <w:color w:val="000000"/>
+                <w:sz w:val="18"/>
+              </w:rPr>
+              <w:t>The fortnight beginning 5 February was topped up from the RDO balance.</w:t>
+            </w:r>
+          </w:p>
+        </w:tc>
+      </w:tr>
+      <w:tr>
+        <w:trPr/>
+        <w:tc>
+          <w:tcPr>
+            <w:tcW w:type="dxa" w:w="652"/>
+            <w:tcMar>
+              <w:top w:w="65" w:type="dxa"/>
+              <w:left w:w="80" w:type="dxa"/>
+              <w:bottom w:w="65" w:type="dxa"/>
+              <w:right w:w="80" w:type="dxa"/>
+            </w:tcMar>
+          </w:tcPr>
+          <w:p>
+            <w:pPr>
+              <w:spacing w:after="40" w:before="40" w:line="252" w:lineRule="auto"/>
+            </w:pPr>
+            <w:r>
+              <w:rPr>
+                <w:rFonts w:ascii="Arial" w:hAnsi="Arial"/>
+                <w:b/>
+                <w:color w:val="000000"/>
+                <w:sz w:val="18"/>
+              </w:rPr>
+              <w:t>2(b)</w:t>
+            </w:r>
+          </w:p>
+        </w:tc>
+        <w:tc>
+          <w:tcPr>
+            <w:tcW w:type="dxa" w:w="1616"/>
+            <w:tcMar>
+              <w:top w:w="65" w:type="dxa"/>
+              <w:left w:w="80" w:type="dxa"/>
+              <w:bottom w:w="65" w:type="dxa"/>
+              <w:right w:w="80" w:type="dxa"/>
+            </w:tcMar>
+          </w:tcPr>
+          <w:p>
+            <w:pPr>
+              <w:spacing w:after="40" w:before="40" w:line="252" w:lineRule="auto"/>
+            </w:pPr>
+            <w:r>
+              <w:rPr>
+                <w:rFonts w:ascii="Arial" w:hAnsi="Arial"/>
+                <w:b w:val="0"/>
+                <w:color w:val="000000"/>
+                <w:sz w:val="18"/>
+              </w:rPr>
+              <w:t>20 February to 1 March 2024</w:t>
+            </w:r>
+          </w:p>
+        </w:tc>
+        <w:tc>
+          <w:tcPr>
+            <w:tcW w:type="dxa" w:w="2296"/>
+            <w:tcMar>
+              <w:top w:w="65" w:type="dxa"/>
+              <w:left w:w="80" w:type="dxa"/>
+              <w:bottom w:w="65" w:type="dxa"/>
+              <w:right w:w="80" w:type="dxa"/>
+            </w:tcMar>
+          </w:tcPr>
+          <w:p>
+            <w:pPr>
+              <w:spacing w:after="40" w:before="40" w:line="252" w:lineRule="auto"/>
+            </w:pPr>
+            <w:r>
+              <w:rPr>
+                <w:rFonts w:ascii="Arial" w:hAnsi="Arial"/>
+                <w:b w:val="0"/>
+                <w:color w:val="000000"/>
+                <w:sz w:val="18"/>
+              </w:rPr>
+              <w:t>Processing of paid pandemic leave</w:t>
+            </w:r>
+          </w:p>
+        </w:tc>
+        <w:tc>
+          <w:tcPr>
+            <w:tcW w:type="dxa" w:w="5017"/>
+            <w:tcMar>
+              <w:top w:w="65" w:type="dxa"/>
+              <w:left w:w="80" w:type="dxa"/>
+              <w:bottom w:w="65" w:type="dxa"/>
+              <w:right w:w="80" w:type="dxa"/>
+            </w:tcMar>
+          </w:tcPr>
+          <w:p>
+            <w:pPr>
+              <w:spacing w:after="40" w:before="40" w:line="252" w:lineRule="auto"/>
+            </w:pPr>
+            <w:r>
+              <w:rPr>
+                <w:rFonts w:ascii="Arial" w:hAnsi="Arial"/>
+                <w:b w:val="0"/>
+                <w:color w:val="000000"/>
+                <w:sz w:val="18"/>
+              </w:rPr>
+              <w:t>Three submissions and two declines before final approval.</w:t>
+            </w:r>
+          </w:p>
+        </w:tc>
+      </w:tr>
+      <w:tr>
+        <w:trPr/>
+        <w:tc>
+          <w:tcPr>
+            <w:tcW w:type="dxa" w:w="652"/>
+            <w:tcMar>
+              <w:top w:w="65" w:type="dxa"/>
+              <w:left w:w="80" w:type="dxa"/>
+              <w:bottom w:w="65" w:type="dxa"/>
+              <w:right w:w="80" w:type="dxa"/>
+            </w:tcMar>
+          </w:tcPr>
+          <w:p>
+            <w:pPr>
+              <w:spacing w:after="40" w:before="40" w:line="252" w:lineRule="auto"/>
+            </w:pPr>
+            <w:r>
+              <w:rPr>
+                <w:rFonts w:ascii="Arial" w:hAnsi="Arial"/>
+                <w:b/>
+                <w:color w:val="000000"/>
+                <w:sz w:val="18"/>
+              </w:rPr>
+              <w:t>2(c)</w:t>
+            </w:r>
+          </w:p>
+        </w:tc>
+        <w:tc>
+          <w:tcPr>
+            <w:tcW w:type="dxa" w:w="1616"/>
+            <w:tcMar>
+              <w:top w:w="65" w:type="dxa"/>
+              <w:left w:w="80" w:type="dxa"/>
+              <w:bottom w:w="65" w:type="dxa"/>
+              <w:right w:w="80" w:type="dxa"/>
+            </w:tcMar>
+          </w:tcPr>
+          <w:p>
+            <w:pPr>
+              <w:spacing w:after="40" w:before="40" w:line="252" w:lineRule="auto"/>
+            </w:pPr>
+            <w:r>
+              <w:rPr>
+                <w:rFonts w:ascii="Arial" w:hAnsi="Arial"/>
+                <w:b w:val="0"/>
+                <w:color w:val="000000"/>
+                <w:sz w:val="18"/>
+              </w:rPr>
+              <w:t>28 February 2024</w:t>
+            </w:r>
+          </w:p>
+        </w:tc>
+        <w:tc>
+          <w:tcPr>
+            <w:tcW w:type="dxa" w:w="2296"/>
+            <w:tcMar>
+              <w:top w:w="65" w:type="dxa"/>
+              <w:left w:w="80" w:type="dxa"/>
+              <w:bottom w:w="65" w:type="dxa"/>
+              <w:right w:w="80" w:type="dxa"/>
+            </w:tcMar>
+          </w:tcPr>
+          <w:p>
+            <w:pPr>
+              <w:spacing w:after="40" w:before="40" w:line="252" w:lineRule="auto"/>
+            </w:pPr>
+            <w:r>
+              <w:rPr>
+                <w:rFonts w:ascii="Arial" w:hAnsi="Arial"/>
+                <w:b w:val="0"/>
+                <w:color w:val="000000"/>
+                <w:sz w:val="18"/>
+              </w:rPr>
+              <w:t>Second shift recorded as seven hours</w:t>
+            </w:r>
+          </w:p>
+        </w:tc>
+        <w:tc>
+          <w:tcPr>
+            <w:tcW w:type="dxa" w:w="5017"/>
+            <w:tcMar>
+              <w:top w:w="65" w:type="dxa"/>
+              <w:left w:w="80" w:type="dxa"/>
+              <w:bottom w:w="65" w:type="dxa"/>
+              <w:right w:w="80" w:type="dxa"/>
+            </w:tcMar>
+          </w:tcPr>
+          <w:p>
+            <w:pPr>
+              <w:spacing w:after="40" w:before="40" w:line="252" w:lineRule="auto"/>
+            </w:pPr>
+            <w:r>
+              <w:rPr>
+                <w:rFonts w:ascii="Arial" w:hAnsi="Arial"/>
+                <w:b w:val="0"/>
+                <w:color w:val="000000"/>
+                <w:sz w:val="18"/>
+              </w:rPr>
+              <w:t>The fortnight beginning 19 February was also topped up from the RDO balance.</w:t>
+            </w:r>
+          </w:p>
+        </w:tc>
+      </w:tr>
+      <w:tr>
+        <w:trPr/>
+        <w:tc>
+          <w:tcPr>
+            <w:tcW w:type="dxa" w:w="652"/>
+            <w:tcMar>
+              <w:top w:w="65" w:type="dxa"/>
+              <w:left w:w="80" w:type="dxa"/>
+              <w:bottom w:w="65" w:type="dxa"/>
+              <w:right w:w="80" w:type="dxa"/>
+            </w:tcMar>
+          </w:tcPr>
+          <w:p>
+            <w:pPr>
+              <w:spacing w:after="40" w:before="40" w:line="252" w:lineRule="auto"/>
+            </w:pPr>
+            <w:r>
+              <w:rPr>
+                <w:rFonts w:ascii="Arial" w:hAnsi="Arial"/>
+                <w:b/>
+                <w:color w:val="000000"/>
+                <w:sz w:val="18"/>
+              </w:rPr>
+              <w:t>2(d)</w:t>
+            </w:r>
+          </w:p>
+        </w:tc>
+        <w:tc>
+          <w:tcPr>
+            <w:tcW w:type="dxa" w:w="1616"/>
+            <w:tcMar>
+              <w:top w:w="65" w:type="dxa"/>
+              <w:left w:w="80" w:type="dxa"/>
+              <w:bottom w:w="65" w:type="dxa"/>
+              <w:right w:w="80" w:type="dxa"/>
+            </w:tcMar>
+          </w:tcPr>
+          <w:p>
+            <w:pPr>
+              <w:spacing w:after="40" w:before="40" w:line="252" w:lineRule="auto"/>
+            </w:pPr>
+            <w:r>
+              <w:rPr>
+                <w:rFonts w:ascii="Arial" w:hAnsi="Arial"/>
+                <w:b w:val="0"/>
+                <w:color w:val="000000"/>
+                <w:sz w:val="18"/>
+              </w:rPr>
+              <w:t>fortnight beginning 18 March 2024</w:t>
+            </w:r>
+          </w:p>
+        </w:tc>
+        <w:tc>
+          <w:tcPr>
+            <w:tcW w:type="dxa" w:w="2296"/>
+            <w:tcMar>
+              <w:top w:w="65" w:type="dxa"/>
+              <w:left w:w="80" w:type="dxa"/>
+              <w:bottom w:w="65" w:type="dxa"/>
+              <w:right w:w="80" w:type="dxa"/>
+            </w:tcMar>
+          </w:tcPr>
+          <w:p>
+            <w:pPr>
+              <w:spacing w:after="40" w:before="40" w:line="252" w:lineRule="auto"/>
+            </w:pPr>
+            <w:r>
+              <w:rPr>
+                <w:rFonts w:ascii="Arial" w:hAnsi="Arial"/>
+                <w:b w:val="0"/>
+                <w:color w:val="000000"/>
+                <w:sz w:val="18"/>
+              </w:rPr>
+              <w:t>Overtime recorded as ordinary shifts</w:t>
+            </w:r>
+          </w:p>
+        </w:tc>
+        <w:tc>
+          <w:tcPr>
+            <w:tcW w:type="dxa" w:w="5017"/>
+            <w:tcMar>
+              <w:top w:w="65" w:type="dxa"/>
+              <w:left w:w="80" w:type="dxa"/>
+              <w:bottom w:w="65" w:type="dxa"/>
+              <w:right w:w="80" w:type="dxa"/>
+            </w:tcMar>
+          </w:tcPr>
+          <w:p>
+            <w:pPr>
+              <w:spacing w:after="40" w:before="40" w:line="252" w:lineRule="auto"/>
+            </w:pPr>
+            <w:r>
+              <w:rPr>
+                <w:rFonts w:ascii="Arial" w:hAnsi="Arial"/>
+                <w:b w:val="0"/>
+                <w:color w:val="000000"/>
+                <w:sz w:val="18"/>
+              </w:rPr>
+              <w:t>Payroll identified too many ordinary shifts and a need for overtime coding.</w:t>
+            </w:r>
+          </w:p>
+        </w:tc>
+      </w:tr>
+      <w:tr>
+        <w:trPr/>
+        <w:tc>
+          <w:tcPr>
+            <w:tcW w:type="dxa" w:w="652"/>
+            <w:tcMar>
+              <w:top w:w="65" w:type="dxa"/>
+              <w:left w:w="80" w:type="dxa"/>
+              <w:bottom w:w="65" w:type="dxa"/>
+              <w:right w:w="80" w:type="dxa"/>
+            </w:tcMar>
+          </w:tcPr>
+          <w:p>
+            <w:pPr>
+              <w:spacing w:after="40" w:before="40" w:line="252" w:lineRule="auto"/>
+            </w:pPr>
+            <w:r>
+              <w:rPr>
+                <w:rFonts w:ascii="Arial" w:hAnsi="Arial"/>
+                <w:b/>
+                <w:color w:val="000000"/>
+                <w:sz w:val="18"/>
+              </w:rPr>
+              <w:t>2(e)</w:t>
+            </w:r>
+          </w:p>
+        </w:tc>
+        <w:tc>
+          <w:tcPr>
+            <w:tcW w:type="dxa" w:w="1616"/>
+            <w:tcMar>
+              <w:top w:w="65" w:type="dxa"/>
+              <w:left w:w="80" w:type="dxa"/>
+              <w:bottom w:w="65" w:type="dxa"/>
+              <w:right w:w="80" w:type="dxa"/>
+            </w:tcMar>
+          </w:tcPr>
+          <w:p>
+            <w:pPr>
+              <w:spacing w:after="40" w:before="40" w:line="252" w:lineRule="auto"/>
+            </w:pPr>
+            <w:r>
+              <w:rPr>
+                <w:rFonts w:ascii="Arial" w:hAnsi="Arial"/>
+                <w:b w:val="0"/>
+                <w:color w:val="000000"/>
+                <w:sz w:val="18"/>
+              </w:rPr>
+              <w:t>30 March 2024</w:t>
+            </w:r>
+          </w:p>
+        </w:tc>
+        <w:tc>
+          <w:tcPr>
+            <w:tcW w:type="dxa" w:w="2296"/>
+            <w:tcMar>
+              <w:top w:w="65" w:type="dxa"/>
+              <w:left w:w="80" w:type="dxa"/>
+              <w:bottom w:w="65" w:type="dxa"/>
+              <w:right w:w="80" w:type="dxa"/>
+            </w:tcMar>
+          </w:tcPr>
+          <w:p>
+            <w:pPr>
+              <w:spacing w:after="40" w:before="40" w:line="252" w:lineRule="auto"/>
+            </w:pPr>
+            <w:r>
+              <w:rPr>
+                <w:rFonts w:ascii="Arial" w:hAnsi="Arial"/>
+                <w:b w:val="0"/>
+                <w:color w:val="000000"/>
+                <w:sz w:val="18"/>
+              </w:rPr>
+              <w:t>Public holiday claim submitted late</w:t>
+            </w:r>
+          </w:p>
+        </w:tc>
+        <w:tc>
+          <w:tcPr>
+            <w:tcW w:type="dxa" w:w="5017"/>
+            <w:tcMar>
+              <w:top w:w="65" w:type="dxa"/>
+              <w:left w:w="80" w:type="dxa"/>
+              <w:bottom w:w="65" w:type="dxa"/>
+              <w:right w:w="80" w:type="dxa"/>
+            </w:tcMar>
+          </w:tcPr>
+          <w:p>
+            <w:pPr>
+              <w:spacing w:after="40" w:before="40" w:line="252" w:lineRule="auto"/>
+            </w:pPr>
+            <w:r>
+              <w:rPr>
+                <w:rFonts w:ascii="Arial" w:hAnsi="Arial"/>
+                <w:b w:val="0"/>
+                <w:color w:val="000000"/>
+                <w:sz w:val="18"/>
+              </w:rPr>
+              <w:t>Payroll later described the claim as submitted late.</w:t>
+            </w:r>
+          </w:p>
+        </w:tc>
+      </w:tr>
+      <w:tr>
+        <w:trPr/>
+        <w:tc>
+          <w:tcPr>
+            <w:tcW w:type="dxa" w:w="652"/>
+            <w:tcMar>
+              <w:top w:w="65" w:type="dxa"/>
+              <w:left w:w="80" w:type="dxa"/>
+              <w:bottom w:w="65" w:type="dxa"/>
+              <w:right w:w="80" w:type="dxa"/>
+            </w:tcMar>
+          </w:tcPr>
+          <w:p>
+            <w:pPr>
+              <w:spacing w:after="40" w:before="40" w:line="252" w:lineRule="auto"/>
+            </w:pPr>
+            <w:r>
+              <w:rPr>
+                <w:rFonts w:ascii="Arial" w:hAnsi="Arial"/>
+                <w:b/>
+                <w:color w:val="000000"/>
+                <w:sz w:val="18"/>
+              </w:rPr>
+              <w:t>2(f)</w:t>
+            </w:r>
+          </w:p>
+        </w:tc>
+        <w:tc>
+          <w:tcPr>
+            <w:tcW w:type="dxa" w:w="1616"/>
+            <w:tcMar>
+              <w:top w:w="65" w:type="dxa"/>
+              <w:left w:w="80" w:type="dxa"/>
+              <w:bottom w:w="65" w:type="dxa"/>
+              <w:right w:w="80" w:type="dxa"/>
+            </w:tcMar>
+          </w:tcPr>
+          <w:p>
+            <w:pPr>
+              <w:spacing w:after="40" w:before="40" w:line="252" w:lineRule="auto"/>
+            </w:pPr>
+            <w:r>
+              <w:rPr>
+                <w:rFonts w:ascii="Arial" w:hAnsi="Arial"/>
+                <w:b w:val="0"/>
+                <w:color w:val="000000"/>
+                <w:sz w:val="18"/>
+              </w:rPr>
+              <w:t>fortnight beginning 1 April 2024</w:t>
+            </w:r>
+          </w:p>
+        </w:tc>
+        <w:tc>
+          <w:tcPr>
+            <w:tcW w:type="dxa" w:w="2296"/>
+            <w:tcMar>
+              <w:top w:w="65" w:type="dxa"/>
+              <w:left w:w="80" w:type="dxa"/>
+              <w:bottom w:w="65" w:type="dxa"/>
+              <w:right w:w="80" w:type="dxa"/>
+            </w:tcMar>
+          </w:tcPr>
+          <w:p>
+            <w:pPr>
+              <w:spacing w:after="40" w:before="40" w:line="252" w:lineRule="auto"/>
+            </w:pPr>
+            <w:r>
+              <w:rPr>
+                <w:rFonts w:ascii="Arial" w:hAnsi="Arial"/>
+                <w:b w:val="0"/>
+                <w:color w:val="000000"/>
+                <w:sz w:val="18"/>
+              </w:rPr>
+              <w:t>Hours above the contracted fortnight</w:t>
+            </w:r>
+          </w:p>
+        </w:tc>
+        <w:tc>
+          <w:tcPr>
+            <w:tcW w:type="dxa" w:w="5017"/>
+            <w:tcMar>
+              <w:top w:w="65" w:type="dxa"/>
+              <w:left w:w="80" w:type="dxa"/>
+              <w:bottom w:w="65" w:type="dxa"/>
+              <w:right w:w="80" w:type="dxa"/>
+            </w:tcMar>
+          </w:tcPr>
+          <w:p>
+            <w:pPr>
+              <w:spacing w:after="40" w:before="40" w:line="252" w:lineRule="auto"/>
+            </w:pPr>
+            <w:r>
+              <w:rPr>
+                <w:rFonts w:ascii="Arial" w:hAnsi="Arial"/>
+                <w:b w:val="0"/>
+                <w:color w:val="000000"/>
+                <w:sz w:val="18"/>
+              </w:rPr>
+              <w:t>Payroll identified a further requirement for overtime coding.</w:t>
+            </w:r>
+          </w:p>
+        </w:tc>
+      </w:tr>
+      <w:tr>
+        <w:trPr/>
+        <w:tc>
+          <w:tcPr>
+            <w:tcW w:type="dxa" w:w="652"/>
+            <w:tcMar>
+              <w:top w:w="65" w:type="dxa"/>
+              <w:left w:w="80" w:type="dxa"/>
+              <w:bottom w:w="65" w:type="dxa"/>
+              <w:right w:w="80" w:type="dxa"/>
+            </w:tcMar>
+          </w:tcPr>
+          <w:p>
+            <w:pPr>
+              <w:spacing w:after="40" w:before="40" w:line="252" w:lineRule="auto"/>
+            </w:pPr>
+            <w:r>
+              <w:rPr>
+                <w:rFonts w:ascii="Arial" w:hAnsi="Arial"/>
+                <w:b/>
+                <w:color w:val="000000"/>
+                <w:sz w:val="18"/>
+              </w:rPr>
+              <w:t>2(g)</w:t>
+            </w:r>
+          </w:p>
+        </w:tc>
+        <w:tc>
+          <w:tcPr>
+            <w:tcW w:type="dxa" w:w="1616"/>
+            <w:tcMar>
+              <w:top w:w="65" w:type="dxa"/>
+              <w:left w:w="80" w:type="dxa"/>
+              <w:bottom w:w="65" w:type="dxa"/>
+              <w:right w:w="80" w:type="dxa"/>
+            </w:tcMar>
+          </w:tcPr>
+          <w:p>
+            <w:pPr>
+              <w:spacing w:after="40" w:before="40" w:line="252" w:lineRule="auto"/>
+            </w:pPr>
+            <w:r>
+              <w:rPr>
+                <w:rFonts w:ascii="Arial" w:hAnsi="Arial"/>
+                <w:b w:val="0"/>
+                <w:color w:val="000000"/>
+                <w:sz w:val="18"/>
+              </w:rPr>
+              <w:t>8 April to 1 May 2024</w:t>
+            </w:r>
+          </w:p>
+        </w:tc>
+        <w:tc>
+          <w:tcPr>
+            <w:tcW w:type="dxa" w:w="2296"/>
+            <w:tcMar>
+              <w:top w:w="65" w:type="dxa"/>
+              <w:left w:w="80" w:type="dxa"/>
+              <w:bottom w:w="65" w:type="dxa"/>
+              <w:right w:w="80" w:type="dxa"/>
+            </w:tcMar>
+          </w:tcPr>
+          <w:p>
+            <w:pPr>
+              <w:spacing w:after="40" w:before="40" w:line="252" w:lineRule="auto"/>
+            </w:pPr>
+            <w:r>
+              <w:rPr>
+                <w:rFonts w:ascii="Arial" w:hAnsi="Arial"/>
+                <w:b w:val="0"/>
+                <w:color w:val="000000"/>
+                <w:sz w:val="18"/>
+              </w:rPr>
+              <w:t>Pay enquiry and public holiday review</w:t>
+            </w:r>
+          </w:p>
+        </w:tc>
+        <w:tc>
+          <w:tcPr>
+            <w:tcW w:type="dxa" w:w="5017"/>
+            <w:tcMar>
+              <w:top w:w="65" w:type="dxa"/>
+              <w:left w:w="80" w:type="dxa"/>
+              <w:bottom w:w="65" w:type="dxa"/>
+              <w:right w:w="80" w:type="dxa"/>
+            </w:tcMar>
+          </w:tcPr>
+          <w:p>
+            <w:pPr>
+              <w:spacing w:after="40" w:before="40" w:line="252" w:lineRule="auto"/>
+            </w:pPr>
+            <w:r>
+              <w:rPr>
+                <w:rFonts w:ascii="Arial" w:hAnsi="Arial"/>
+                <w:b w:val="0"/>
+                <w:color w:val="000000"/>
+                <w:sz w:val="18"/>
+              </w:rPr>
+              <w:t>Enquiry, acknowledgment, follow-up and response; public holiday review remained open.</w:t>
+            </w:r>
+          </w:p>
+        </w:tc>
+      </w:tr>
+      <w:tr>
+        <w:trPr/>
+        <w:tc>
+          <w:tcPr>
+            <w:tcW w:type="dxa" w:w="652"/>
+            <w:tcMar>
+              <w:top w:w="65" w:type="dxa"/>
+              <w:left w:w="80" w:type="dxa"/>
+              <w:bottom w:w="65" w:type="dxa"/>
+              <w:right w:w="80" w:type="dxa"/>
+            </w:tcMar>
+          </w:tcPr>
+          <w:p>
+            <w:pPr>
+              <w:spacing w:after="40" w:before="40" w:line="252" w:lineRule="auto"/>
+            </w:pPr>
+            <w:r>
+              <w:rPr>
+                <w:rFonts w:ascii="Arial" w:hAnsi="Arial"/>
+                <w:b/>
+                <w:color w:val="000000"/>
+                <w:sz w:val="18"/>
+              </w:rPr>
+              <w:t>2(h)</w:t>
+            </w:r>
+          </w:p>
+        </w:tc>
+        <w:tc>
+          <w:tcPr>
+            <w:tcW w:type="dxa" w:w="1616"/>
+            <w:tcMar>
+              <w:top w:w="65" w:type="dxa"/>
+              <w:left w:w="80" w:type="dxa"/>
+              <w:bottom w:w="65" w:type="dxa"/>
+              <w:right w:w="80" w:type="dxa"/>
+            </w:tcMar>
+          </w:tcPr>
+          <w:p>
+            <w:pPr>
+              <w:spacing w:after="40" w:before="40" w:line="252" w:lineRule="auto"/>
+            </w:pPr>
+            <w:r>
+              <w:rPr>
+                <w:rFonts w:ascii="Arial" w:hAnsi="Arial"/>
+                <w:b w:val="0"/>
+                <w:color w:val="000000"/>
+                <w:sz w:val="18"/>
+              </w:rPr>
+              <w:t>3 May 2024</w:t>
+            </w:r>
+          </w:p>
+        </w:tc>
+        <w:tc>
+          <w:tcPr>
+            <w:tcW w:type="dxa" w:w="2296"/>
+            <w:tcMar>
+              <w:top w:w="65" w:type="dxa"/>
+              <w:left w:w="80" w:type="dxa"/>
+              <w:bottom w:w="65" w:type="dxa"/>
+              <w:right w:w="80" w:type="dxa"/>
+            </w:tcMar>
+          </w:tcPr>
+          <w:p>
+            <w:pPr>
+              <w:spacing w:after="40" w:before="40" w:line="252" w:lineRule="auto"/>
+            </w:pPr>
+            <w:r>
+              <w:rPr>
+                <w:rFonts w:ascii="Arial" w:hAnsi="Arial"/>
+                <w:b w:val="0"/>
+                <w:color w:val="000000"/>
+                <w:sz w:val="18"/>
+              </w:rPr>
+              <w:t>Payroll directed four fortnight corrections</w:t>
+            </w:r>
+          </w:p>
+        </w:tc>
+        <w:tc>
+          <w:tcPr>
+            <w:tcW w:type="dxa" w:w="5017"/>
+            <w:tcMar>
+              <w:top w:w="65" w:type="dxa"/>
+              <w:left w:w="80" w:type="dxa"/>
+              <w:bottom w:w="65" w:type="dxa"/>
+              <w:right w:w="80" w:type="dxa"/>
+            </w:tcMar>
+          </w:tcPr>
+          <w:p>
+            <w:pPr>
+              <w:spacing w:after="40" w:before="40" w:line="252" w:lineRule="auto"/>
+            </w:pPr>
+            <w:r>
+              <w:rPr>
+                <w:rFonts w:ascii="Arial" w:hAnsi="Arial"/>
+                <w:b w:val="0"/>
+                <w:color w:val="000000"/>
+                <w:sz w:val="18"/>
+              </w:rPr>
+              <w:t>Payroll directed the manager to submit an AVAC for each affected fortnight.</w:t>
+            </w:r>
+          </w:p>
+        </w:tc>
+      </w:tr>
+      <w:tr>
+        <w:trPr/>
+        <w:tc>
+          <w:tcPr>
+            <w:tcW w:type="dxa" w:w="652"/>
+            <w:tcMar>
+              <w:top w:w="65" w:type="dxa"/>
+              <w:left w:w="80" w:type="dxa"/>
+              <w:bottom w:w="65" w:type="dxa"/>
+              <w:right w:w="80" w:type="dxa"/>
+            </w:tcMar>
+          </w:tcPr>
+          <w:p>
+            <w:pPr>
+              <w:spacing w:after="40" w:before="40" w:line="252" w:lineRule="auto"/>
+            </w:pPr>
+            <w:r>
+              <w:rPr>
+                <w:rFonts w:ascii="Arial" w:hAnsi="Arial"/>
+                <w:b/>
+                <w:color w:val="000000"/>
+                <w:sz w:val="18"/>
+              </w:rPr>
+              <w:t>2(i)</w:t>
+            </w:r>
+          </w:p>
+        </w:tc>
+        <w:tc>
+          <w:tcPr>
+            <w:tcW w:type="dxa" w:w="1616"/>
+            <w:tcMar>
+              <w:top w:w="65" w:type="dxa"/>
+              <w:left w:w="80" w:type="dxa"/>
+              <w:bottom w:w="65" w:type="dxa"/>
+              <w:right w:w="80" w:type="dxa"/>
+            </w:tcMar>
+          </w:tcPr>
+          <w:p>
+            <w:pPr>
+              <w:spacing w:after="40" w:before="40" w:line="252" w:lineRule="auto"/>
+            </w:pPr>
+            <w:r>
+              <w:rPr>
+                <w:rFonts w:ascii="Arial" w:hAnsi="Arial"/>
+                <w:b w:val="0"/>
+                <w:color w:val="000000"/>
+                <w:sz w:val="18"/>
+              </w:rPr>
+              <w:t>10 to 13 May 2024</w:t>
+            </w:r>
+          </w:p>
+        </w:tc>
+        <w:tc>
+          <w:tcPr>
+            <w:tcW w:type="dxa" w:w="2296"/>
+            <w:tcMar>
+              <w:top w:w="65" w:type="dxa"/>
+              <w:left w:w="80" w:type="dxa"/>
+              <w:bottom w:w="65" w:type="dxa"/>
+              <w:right w:w="80" w:type="dxa"/>
+            </w:tcMar>
+          </w:tcPr>
+          <w:p>
+            <w:pPr>
+              <w:spacing w:after="40" w:before="40" w:line="252" w:lineRule="auto"/>
+            </w:pPr>
+            <w:r>
+              <w:rPr>
+                <w:rFonts w:ascii="Arial" w:hAnsi="Arial"/>
+                <w:b w:val="0"/>
+                <w:color w:val="000000"/>
+                <w:sz w:val="18"/>
+              </w:rPr>
+              <w:t>Follow-up found no correction</w:t>
+            </w:r>
+          </w:p>
+        </w:tc>
+        <w:tc>
+          <w:tcPr>
+            <w:tcW w:type="dxa" w:w="5017"/>
+            <w:tcMar>
+              <w:top w:w="65" w:type="dxa"/>
+              <w:left w:w="80" w:type="dxa"/>
+              <w:bottom w:w="65" w:type="dxa"/>
+              <w:right w:w="80" w:type="dxa"/>
+            </w:tcMar>
+          </w:tcPr>
+          <w:p>
+            <w:pPr>
+              <w:spacing w:after="40" w:before="40" w:line="252" w:lineRule="auto"/>
+            </w:pPr>
+            <w:r>
+              <w:rPr>
+                <w:rFonts w:ascii="Arial" w:hAnsi="Arial"/>
+                <w:b w:val="0"/>
+                <w:color w:val="000000"/>
+                <w:sz w:val="18"/>
+              </w:rPr>
+              <w:t>The Appellant followed up; Payroll referred him back to the line manager.</w:t>
+            </w:r>
+          </w:p>
+        </w:tc>
+      </w:tr>
+      <w:tr>
+        <w:trPr/>
+        <w:tc>
+          <w:tcPr>
+            <w:tcW w:type="dxa" w:w="652"/>
+            <w:tcMar>
+              <w:top w:w="65" w:type="dxa"/>
+              <w:left w:w="80" w:type="dxa"/>
+              <w:bottom w:w="65" w:type="dxa"/>
+              <w:right w:w="80" w:type="dxa"/>
+            </w:tcMar>
+          </w:tcPr>
+          <w:p>
+            <w:pPr>
+              <w:spacing w:after="40" w:before="40" w:line="252" w:lineRule="auto"/>
+            </w:pPr>
+            <w:r>
+              <w:rPr>
+                <w:rFonts w:ascii="Arial" w:hAnsi="Arial"/>
+                <w:b/>
+                <w:color w:val="000000"/>
+                <w:sz w:val="18"/>
+              </w:rPr>
+              <w:t>2(j)</w:t>
+            </w:r>
+          </w:p>
+        </w:tc>
+        <w:tc>
+          <w:tcPr>
+            <w:tcW w:type="dxa" w:w="1616"/>
+            <w:tcMar>
+              <w:top w:w="65" w:type="dxa"/>
+              <w:left w:w="80" w:type="dxa"/>
+              <w:bottom w:w="65" w:type="dxa"/>
+              <w:right w:w="80" w:type="dxa"/>
+            </w:tcMar>
+          </w:tcPr>
+          <w:p>
+            <w:pPr>
+              <w:spacing w:after="40" w:before="40" w:line="252" w:lineRule="auto"/>
+            </w:pPr>
+            <w:r>
+              <w:rPr>
+                <w:rFonts w:ascii="Arial" w:hAnsi="Arial"/>
+                <w:b w:val="0"/>
+                <w:color w:val="000000"/>
+                <w:sz w:val="18"/>
+              </w:rPr>
+              <w:t>15 to 16 May 2024</w:t>
+            </w:r>
+          </w:p>
+        </w:tc>
+        <w:tc>
+          <w:tcPr>
+            <w:tcW w:type="dxa" w:w="2296"/>
+            <w:tcMar>
+              <w:top w:w="65" w:type="dxa"/>
+              <w:left w:w="80" w:type="dxa"/>
+              <w:bottom w:w="65" w:type="dxa"/>
+              <w:right w:w="80" w:type="dxa"/>
+            </w:tcMar>
+          </w:tcPr>
+          <w:p>
+            <w:pPr>
+              <w:spacing w:after="40" w:before="40" w:line="252" w:lineRule="auto"/>
+            </w:pPr>
+            <w:r>
+              <w:rPr>
+                <w:rFonts w:ascii="Arial" w:hAnsi="Arial"/>
+                <w:b w:val="0"/>
+                <w:color w:val="000000"/>
+                <w:sz w:val="18"/>
+              </w:rPr>
+              <w:t>A completed AVAC recorded</w:t>
+            </w:r>
+          </w:p>
+        </w:tc>
+        <w:tc>
+          <w:tcPr>
+            <w:tcW w:type="dxa" w:w="5017"/>
+            <w:tcMar>
+              <w:top w:w="65" w:type="dxa"/>
+              <w:left w:w="80" w:type="dxa"/>
+              <w:bottom w:w="65" w:type="dxa"/>
+              <w:right w:w="80" w:type="dxa"/>
+            </w:tcMar>
+          </w:tcPr>
+          <w:p>
+            <w:pPr>
+              <w:spacing w:after="40" w:before="40" w:line="252" w:lineRule="auto"/>
+            </w:pPr>
+            <w:r>
+              <w:rPr>
+                <w:rFonts w:ascii="Arial" w:hAnsi="Arial"/>
+                <w:b w:val="0"/>
+                <w:color w:val="000000"/>
+                <w:sz w:val="18"/>
+              </w:rPr>
+              <w:t>Process 16328886 was submitted and completed; its relation to the errors needs identification.</w:t>
+            </w:r>
+          </w:p>
+        </w:tc>
+      </w:tr>
+      <w:tr>
+        <w:trPr/>
+        <w:tc>
+          <w:tcPr>
+            <w:tcW w:type="dxa" w:w="652"/>
+            <w:tcMar>
+              <w:top w:w="65" w:type="dxa"/>
+              <w:left w:w="80" w:type="dxa"/>
+              <w:bottom w:w="65" w:type="dxa"/>
+              <w:right w:w="80" w:type="dxa"/>
+            </w:tcMar>
+          </w:tcPr>
+          <w:p>
+            <w:pPr>
+              <w:spacing w:after="40" w:before="40" w:line="252" w:lineRule="auto"/>
+            </w:pPr>
+            <w:r>
+              <w:rPr>
+                <w:rFonts w:ascii="Arial" w:hAnsi="Arial"/>
+                <w:b/>
+                <w:color w:val="000000"/>
+                <w:sz w:val="18"/>
+              </w:rPr>
+              <w:t>2(k)</w:t>
+            </w:r>
+          </w:p>
+        </w:tc>
+        <w:tc>
+          <w:tcPr>
+            <w:tcW w:type="dxa" w:w="1616"/>
+            <w:tcMar>
+              <w:top w:w="65" w:type="dxa"/>
+              <w:left w:w="80" w:type="dxa"/>
+              <w:bottom w:w="65" w:type="dxa"/>
+              <w:right w:w="80" w:type="dxa"/>
+            </w:tcMar>
+          </w:tcPr>
+          <w:p>
+            <w:pPr>
+              <w:spacing w:after="40" w:before="40" w:line="252" w:lineRule="auto"/>
+            </w:pPr>
+            <w:r>
+              <w:rPr>
+                <w:rFonts w:ascii="Arial" w:hAnsi="Arial"/>
+                <w:b w:val="0"/>
+                <w:color w:val="000000"/>
+                <w:sz w:val="18"/>
+              </w:rPr>
+              <w:t>20 May 2024</w:t>
+            </w:r>
+          </w:p>
+        </w:tc>
+        <w:tc>
+          <w:tcPr>
+            <w:tcW w:type="dxa" w:w="2296"/>
+            <w:tcMar>
+              <w:top w:w="65" w:type="dxa"/>
+              <w:left w:w="80" w:type="dxa"/>
+              <w:bottom w:w="65" w:type="dxa"/>
+              <w:right w:w="80" w:type="dxa"/>
+            </w:tcMar>
+          </w:tcPr>
+          <w:p>
+            <w:pPr>
+              <w:spacing w:after="40" w:before="40" w:line="252" w:lineRule="auto"/>
+            </w:pPr>
+            <w:r>
+              <w:rPr>
+                <w:rFonts w:ascii="Arial" w:hAnsi="Arial"/>
+                <w:b w:val="0"/>
+                <w:color w:val="000000"/>
+                <w:sz w:val="18"/>
+              </w:rPr>
+              <w:t>HR follow-up about rostering</w:t>
+            </w:r>
+          </w:p>
+        </w:tc>
+        <w:tc>
+          <w:tcPr>
+            <w:tcW w:type="dxa" w:w="5017"/>
+            <w:tcMar>
+              <w:top w:w="65" w:type="dxa"/>
+              <w:left w:w="80" w:type="dxa"/>
+              <w:bottom w:w="65" w:type="dxa"/>
+              <w:right w:w="80" w:type="dxa"/>
+            </w:tcMar>
+          </w:tcPr>
+          <w:p>
+            <w:pPr>
+              <w:spacing w:after="40" w:before="40" w:line="252" w:lineRule="auto"/>
+            </w:pPr>
+            <w:r>
+              <w:rPr>
+                <w:rFonts w:ascii="Arial" w:hAnsi="Arial"/>
+                <w:b w:val="0"/>
+                <w:color w:val="000000"/>
+                <w:sz w:val="18"/>
+              </w:rPr>
+              <w:t>Reese followed up with HR and attached the fatigue guideline; related context.</w:t>
+            </w:r>
+          </w:p>
+        </w:tc>
+      </w:tr>
+      <w:tr>
+        <w:trPr/>
+        <w:tc>
+          <w:tcPr>
+            <w:tcW w:type="dxa" w:w="652"/>
+            <w:tcMar>
+              <w:top w:w="65" w:type="dxa"/>
+              <w:left w:w="80" w:type="dxa"/>
+              <w:bottom w:w="65" w:type="dxa"/>
+              <w:right w:w="80" w:type="dxa"/>
+            </w:tcMar>
+          </w:tcPr>
+          <w:p>
+            <w:pPr>
+              <w:spacing w:after="40" w:before="40" w:line="252" w:lineRule="auto"/>
+            </w:pPr>
+            <w:r>
+              <w:rPr>
+                <w:rFonts w:ascii="Arial" w:hAnsi="Arial"/>
+                <w:b/>
+                <w:color w:val="000000"/>
+                <w:sz w:val="18"/>
+              </w:rPr>
+              <w:t>2(l)</w:t>
+            </w:r>
+          </w:p>
+        </w:tc>
+        <w:tc>
+          <w:tcPr>
+            <w:tcW w:type="dxa" w:w="1616"/>
+            <w:tcMar>
+              <w:top w:w="65" w:type="dxa"/>
+              <w:left w:w="80" w:type="dxa"/>
+              <w:bottom w:w="65" w:type="dxa"/>
+              <w:right w:w="80" w:type="dxa"/>
+            </w:tcMar>
+          </w:tcPr>
+          <w:p>
+            <w:pPr>
+              <w:spacing w:after="40" w:before="40" w:line="252" w:lineRule="auto"/>
+            </w:pPr>
+            <w:r>
+              <w:rPr>
+                <w:rFonts w:ascii="Arial" w:hAnsi="Arial"/>
+                <w:b w:val="0"/>
+                <w:color w:val="000000"/>
+                <w:sz w:val="18"/>
+              </w:rPr>
+              <w:t>21 May 2024</w:t>
+            </w:r>
+          </w:p>
+        </w:tc>
+        <w:tc>
+          <w:tcPr>
+            <w:tcW w:type="dxa" w:w="2296"/>
+            <w:tcMar>
+              <w:top w:w="65" w:type="dxa"/>
+              <w:left w:w="80" w:type="dxa"/>
+              <w:bottom w:w="65" w:type="dxa"/>
+              <w:right w:w="80" w:type="dxa"/>
+            </w:tcMar>
+          </w:tcPr>
+          <w:p>
+            <w:pPr>
+              <w:spacing w:after="40" w:before="40" w:line="252" w:lineRule="auto"/>
+            </w:pPr>
+            <w:r>
+              <w:rPr>
+                <w:rFonts w:ascii="Arial" w:hAnsi="Arial"/>
+                <w:b w:val="0"/>
+                <w:color w:val="000000"/>
+                <w:sz w:val="18"/>
+              </w:rPr>
+              <w:t>Manager awaited Payroll confirmation</w:t>
+            </w:r>
+          </w:p>
+        </w:tc>
+        <w:tc>
+          <w:tcPr>
+            <w:tcW w:type="dxa" w:w="5017"/>
+            <w:tcMar>
+              <w:top w:w="65" w:type="dxa"/>
+              <w:left w:w="80" w:type="dxa"/>
+              <w:bottom w:w="65" w:type="dxa"/>
+              <w:right w:w="80" w:type="dxa"/>
+            </w:tcMar>
+          </w:tcPr>
+          <w:p>
+            <w:pPr>
+              <w:spacing w:after="40" w:before="40" w:line="252" w:lineRule="auto"/>
+            </w:pPr>
+            <w:r>
+              <w:rPr>
+                <w:rFonts w:ascii="Arial" w:hAnsi="Arial"/>
+                <w:b w:val="0"/>
+                <w:color w:val="000000"/>
+                <w:sz w:val="18"/>
+              </w:rPr>
+              <w:t>The manager said she was still waiting for confirmation.</w:t>
+            </w:r>
+          </w:p>
+        </w:tc>
+      </w:tr>
+      <w:tr>
+        <w:trPr/>
+        <w:tc>
+          <w:tcPr>
+            <w:tcW w:type="dxa" w:w="652"/>
+            <w:tcMar>
+              <w:top w:w="65" w:type="dxa"/>
+              <w:left w:w="80" w:type="dxa"/>
+              <w:bottom w:w="65" w:type="dxa"/>
+              <w:right w:w="80" w:type="dxa"/>
+            </w:tcMar>
+          </w:tcPr>
+          <w:p>
+            <w:pPr>
+              <w:spacing w:after="40" w:before="40" w:line="252" w:lineRule="auto"/>
+            </w:pPr>
+            <w:r>
+              <w:rPr>
+                <w:rFonts w:ascii="Arial" w:hAnsi="Arial"/>
+                <w:b/>
+                <w:color w:val="000000"/>
+                <w:sz w:val="18"/>
+              </w:rPr>
+              <w:t>2(m)</w:t>
+            </w:r>
+          </w:p>
+        </w:tc>
+        <w:tc>
+          <w:tcPr>
+            <w:tcW w:type="dxa" w:w="1616"/>
+            <w:tcMar>
+              <w:top w:w="65" w:type="dxa"/>
+              <w:left w:w="80" w:type="dxa"/>
+              <w:bottom w:w="65" w:type="dxa"/>
+              <w:right w:w="80" w:type="dxa"/>
+            </w:tcMar>
+          </w:tcPr>
+          <w:p>
+            <w:pPr>
+              <w:spacing w:after="40" w:before="40" w:line="252" w:lineRule="auto"/>
+            </w:pPr>
+            <w:r>
+              <w:rPr>
+                <w:rFonts w:ascii="Arial" w:hAnsi="Arial"/>
+                <w:b w:val="0"/>
+                <w:color w:val="000000"/>
+                <w:sz w:val="18"/>
+              </w:rPr>
+              <w:t>28 to 30 May 2024</w:t>
+            </w:r>
+          </w:p>
+        </w:tc>
+        <w:tc>
+          <w:tcPr>
+            <w:tcW w:type="dxa" w:w="2296"/>
+            <w:tcMar>
+              <w:top w:w="65" w:type="dxa"/>
+              <w:left w:w="80" w:type="dxa"/>
+              <w:bottom w:w="65" w:type="dxa"/>
+              <w:right w:w="80" w:type="dxa"/>
+            </w:tcMar>
+          </w:tcPr>
+          <w:p>
+            <w:pPr>
+              <w:spacing w:after="40" w:before="40" w:line="252" w:lineRule="auto"/>
+            </w:pPr>
+            <w:r>
+              <w:rPr>
+                <w:rFonts w:ascii="Arial" w:hAnsi="Arial"/>
+                <w:b w:val="0"/>
+                <w:color w:val="000000"/>
+                <w:sz w:val="18"/>
+              </w:rPr>
+              <w:t>Validation request and partly completed AVAC</w:t>
+            </w:r>
+          </w:p>
+        </w:tc>
+        <w:tc>
+          <w:tcPr>
+            <w:tcW w:type="dxa" w:w="5017"/>
+            <w:tcMar>
+              <w:top w:w="65" w:type="dxa"/>
+              <w:left w:w="80" w:type="dxa"/>
+              <w:bottom w:w="65" w:type="dxa"/>
+              <w:right w:w="80" w:type="dxa"/>
+            </w:tcMar>
+          </w:tcPr>
+          <w:p>
+            <w:pPr>
+              <w:spacing w:after="40" w:before="40" w:line="252" w:lineRule="auto"/>
+            </w:pPr>
+            <w:r>
+              <w:rPr>
+                <w:rFonts w:ascii="Arial" w:hAnsi="Arial"/>
+                <w:b w:val="0"/>
+                <w:color w:val="000000"/>
+                <w:sz w:val="18"/>
+              </w:rPr>
+              <w:t>Validation sought; process 16450619 was recorded as "Part Completed".</w:t>
+            </w:r>
+          </w:p>
+        </w:tc>
+      </w:tr>
+      <w:tr>
+        <w:trPr/>
+        <w:tc>
+          <w:tcPr>
+            <w:tcW w:type="dxa" w:w="652"/>
+            <w:tcMar>
+              <w:top w:w="65" w:type="dxa"/>
+              <w:left w:w="80" w:type="dxa"/>
+              <w:bottom w:w="65" w:type="dxa"/>
+              <w:right w:w="80" w:type="dxa"/>
+            </w:tcMar>
+          </w:tcPr>
+          <w:p>
+            <w:pPr>
+              <w:spacing w:after="40" w:before="40" w:line="252" w:lineRule="auto"/>
+            </w:pPr>
+            <w:r>
+              <w:rPr>
+                <w:rFonts w:ascii="Arial" w:hAnsi="Arial"/>
+                <w:b/>
+                <w:color w:val="000000"/>
+                <w:sz w:val="18"/>
+              </w:rPr>
+              <w:t>2(n)</w:t>
+            </w:r>
+          </w:p>
+        </w:tc>
+        <w:tc>
+          <w:tcPr>
+            <w:tcW w:type="dxa" w:w="1616"/>
+            <w:tcMar>
+              <w:top w:w="65" w:type="dxa"/>
+              <w:left w:w="80" w:type="dxa"/>
+              <w:bottom w:w="65" w:type="dxa"/>
+              <w:right w:w="80" w:type="dxa"/>
+            </w:tcMar>
+          </w:tcPr>
+          <w:p>
+            <w:pPr>
+              <w:spacing w:after="40" w:before="40" w:line="252" w:lineRule="auto"/>
+            </w:pPr>
+            <w:r>
+              <w:rPr>
+                <w:rFonts w:ascii="Arial" w:hAnsi="Arial"/>
+                <w:b w:val="0"/>
+                <w:color w:val="000000"/>
+                <w:sz w:val="18"/>
+              </w:rPr>
+              <w:t>5 June 2024</w:t>
+            </w:r>
+          </w:p>
+        </w:tc>
+        <w:tc>
+          <w:tcPr>
+            <w:tcW w:type="dxa" w:w="2296"/>
+            <w:tcMar>
+              <w:top w:w="65" w:type="dxa"/>
+              <w:left w:w="80" w:type="dxa"/>
+              <w:bottom w:w="65" w:type="dxa"/>
+              <w:right w:w="80" w:type="dxa"/>
+            </w:tcMar>
+          </w:tcPr>
+          <w:p>
+            <w:pPr>
+              <w:spacing w:after="40" w:before="40" w:line="252" w:lineRule="auto"/>
+            </w:pPr>
+            <w:r>
+              <w:rPr>
+                <w:rFonts w:ascii="Arial" w:hAnsi="Arial"/>
+                <w:b w:val="0"/>
+                <w:color w:val="000000"/>
+                <w:sz w:val="18"/>
+              </w:rPr>
+              <w:t>Three corrections reached a payslip</w:t>
+            </w:r>
+          </w:p>
+        </w:tc>
+        <w:tc>
+          <w:tcPr>
+            <w:tcW w:type="dxa" w:w="5017"/>
+            <w:tcMar>
+              <w:top w:w="65" w:type="dxa"/>
+              <w:left w:w="80" w:type="dxa"/>
+              <w:bottom w:w="65" w:type="dxa"/>
+              <w:right w:w="80" w:type="dxa"/>
+            </w:tcMar>
+          </w:tcPr>
+          <w:p>
+            <w:pPr>
+              <w:spacing w:after="40" w:before="40" w:line="252" w:lineRule="auto"/>
+            </w:pPr>
+            <w:r>
+              <w:rPr>
+                <w:rFonts w:ascii="Arial" w:hAnsi="Arial"/>
+                <w:b w:val="0"/>
+                <w:color w:val="000000"/>
+                <w:sz w:val="18"/>
+              </w:rPr>
+              <w:t>Payroll identified adjustments for 28 February, 30 March and 1 April.</w:t>
+            </w:r>
+          </w:p>
+        </w:tc>
+      </w:tr>
+      <w:tr>
+        <w:trPr/>
+        <w:tc>
+          <w:tcPr>
+            <w:tcW w:type="dxa" w:w="652"/>
+            <w:tcMar>
+              <w:top w:w="65" w:type="dxa"/>
+              <w:left w:w="80" w:type="dxa"/>
+              <w:bottom w:w="65" w:type="dxa"/>
+              <w:right w:w="80" w:type="dxa"/>
+            </w:tcMar>
+          </w:tcPr>
+          <w:p>
+            <w:pPr>
+              <w:spacing w:after="40" w:before="40" w:line="252" w:lineRule="auto"/>
+            </w:pPr>
+            <w:r>
+              <w:rPr>
+                <w:rFonts w:ascii="Arial" w:hAnsi="Arial"/>
+                <w:b/>
+                <w:color w:val="000000"/>
+                <w:sz w:val="18"/>
+              </w:rPr>
+              <w:t>2(o)</w:t>
+            </w:r>
+          </w:p>
+        </w:tc>
+        <w:tc>
+          <w:tcPr>
+            <w:tcW w:type="dxa" w:w="1616"/>
+            <w:tcMar>
+              <w:top w:w="65" w:type="dxa"/>
+              <w:left w:w="80" w:type="dxa"/>
+              <w:bottom w:w="65" w:type="dxa"/>
+              <w:right w:w="80" w:type="dxa"/>
+            </w:tcMar>
+          </w:tcPr>
+          <w:p>
+            <w:pPr>
+              <w:spacing w:after="40" w:before="40" w:line="252" w:lineRule="auto"/>
+            </w:pPr>
+            <w:r>
+              <w:rPr>
+                <w:rFonts w:ascii="Arial" w:hAnsi="Arial"/>
+                <w:b w:val="0"/>
+                <w:color w:val="000000"/>
+                <w:sz w:val="18"/>
+              </w:rPr>
+              <w:t>30 June to 2 July 2025</w:t>
+            </w:r>
+          </w:p>
+        </w:tc>
+        <w:tc>
+          <w:tcPr>
+            <w:tcW w:type="dxa" w:w="2296"/>
+            <w:tcMar>
+              <w:top w:w="65" w:type="dxa"/>
+              <w:left w:w="80" w:type="dxa"/>
+              <w:bottom w:w="65" w:type="dxa"/>
+              <w:right w:w="80" w:type="dxa"/>
+            </w:tcMar>
+          </w:tcPr>
+          <w:p>
+            <w:pPr>
+              <w:spacing w:after="40" w:before="40" w:line="252" w:lineRule="auto"/>
+            </w:pPr>
+            <w:r>
+              <w:rPr>
+                <w:rFonts w:ascii="Arial" w:hAnsi="Arial"/>
+                <w:b w:val="0"/>
+                <w:color w:val="000000"/>
+                <w:sz w:val="18"/>
+              </w:rPr>
+              <w:t>Later correction of the 9 February shift</w:t>
+            </w:r>
+          </w:p>
+        </w:tc>
+        <w:tc>
+          <w:tcPr>
+            <w:tcW w:type="dxa" w:w="5017"/>
+            <w:tcMar>
+              <w:top w:w="65" w:type="dxa"/>
+              <w:left w:w="80" w:type="dxa"/>
+              <w:bottom w:w="65" w:type="dxa"/>
+              <w:right w:w="80" w:type="dxa"/>
+            </w:tcMar>
+          </w:tcPr>
+          <w:p>
+            <w:pPr>
+              <w:spacing w:after="40" w:before="40" w:line="252" w:lineRule="auto"/>
+            </w:pPr>
+            <w:r>
+              <w:rPr>
+                <w:rFonts w:ascii="Arial" w:hAnsi="Arial"/>
+                <w:b w:val="0"/>
+                <w:color w:val="000000"/>
+                <w:sz w:val="18"/>
+              </w:rPr>
+              <w:t>Payroll identified a later amendment and pay date; evidence of the earlier correction history.</w:t>
+            </w:r>
+          </w:p>
+        </w:tc>
+      </w:tr>
+      <w:tr>
+        <w:trPr/>
+        <w:tc>
+          <w:tcPr>
+            <w:tcW w:type="dxa" w:w="652"/>
+            <w:tcMar>
+              <w:top w:w="65" w:type="dxa"/>
+              <w:left w:w="80" w:type="dxa"/>
+              <w:bottom w:w="65" w:type="dxa"/>
+              <w:right w:w="80" w:type="dxa"/>
+            </w:tcMar>
+          </w:tcPr>
+          <w:p>
+            <w:pPr>
+              <w:spacing w:after="40" w:before="40" w:line="252" w:lineRule="auto"/>
+            </w:pPr>
+            <w:r>
+              <w:rPr>
+                <w:rFonts w:ascii="Arial" w:hAnsi="Arial"/>
+                <w:b/>
+                <w:color w:val="000000"/>
+                <w:sz w:val="18"/>
+              </w:rPr>
+              <w:t>3(a)</w:t>
+            </w:r>
+          </w:p>
+        </w:tc>
+        <w:tc>
+          <w:tcPr>
+            <w:tcW w:type="dxa" w:w="1616"/>
+            <w:tcMar>
+              <w:top w:w="65" w:type="dxa"/>
+              <w:left w:w="80" w:type="dxa"/>
+              <w:bottom w:w="65" w:type="dxa"/>
+              <w:right w:w="80" w:type="dxa"/>
+            </w:tcMar>
+          </w:tcPr>
+          <w:p>
+            <w:pPr>
+              <w:spacing w:after="40" w:before="40" w:line="252" w:lineRule="auto"/>
+            </w:pPr>
+            <w:r>
+              <w:rPr>
+                <w:rFonts w:ascii="Arial" w:hAnsi="Arial"/>
+                <w:b w:val="0"/>
+                <w:color w:val="000000"/>
+                <w:sz w:val="18"/>
+              </w:rPr>
+              <w:t>7 August to 4 September 2023</w:t>
+            </w:r>
+          </w:p>
+        </w:tc>
+        <w:tc>
+          <w:tcPr>
+            <w:tcW w:type="dxa" w:w="2296"/>
+            <w:tcMar>
+              <w:top w:w="65" w:type="dxa"/>
+              <w:left w:w="80" w:type="dxa"/>
+              <w:bottom w:w="65" w:type="dxa"/>
+              <w:right w:w="80" w:type="dxa"/>
+            </w:tcMar>
+          </w:tcPr>
+          <w:p>
+            <w:pPr>
+              <w:spacing w:after="40" w:before="40" w:line="252" w:lineRule="auto"/>
+            </w:pPr>
+            <w:r>
+              <w:rPr>
+                <w:rFonts w:ascii="Arial" w:hAnsi="Arial"/>
+                <w:b w:val="0"/>
+                <w:color w:val="000000"/>
+                <w:sz w:val="18"/>
+              </w:rPr>
+              <w:t>Earlier roster error and proposed roster</w:t>
+            </w:r>
+          </w:p>
+        </w:tc>
+        <w:tc>
+          <w:tcPr>
+            <w:tcW w:type="dxa" w:w="5017"/>
+            <w:tcMar>
+              <w:top w:w="65" w:type="dxa"/>
+              <w:left w:w="80" w:type="dxa"/>
+              <w:bottom w:w="65" w:type="dxa"/>
+              <w:right w:w="80" w:type="dxa"/>
+            </w:tcMar>
+          </w:tcPr>
+          <w:p>
+            <w:pPr>
+              <w:spacing w:after="40" w:before="40" w:line="252" w:lineRule="auto"/>
+            </w:pPr>
+            <w:r>
+              <w:rPr>
+                <w:rFonts w:ascii="Arial" w:hAnsi="Arial"/>
+                <w:b w:val="0"/>
+                <w:color w:val="000000"/>
+                <w:sz w:val="18"/>
+              </w:rPr>
+              <w:t xml:space="preserve">Rest was offered after an acknowledged error; the Appellant proposed increased hours; context only.</w:t>
+            </w:r>
+          </w:p>
+        </w:tc>
+      </w:tr>
+      <w:tr>
+        <w:trPr/>
+        <w:tc>
+          <w:tcPr>
+            <w:tcW w:type="dxa" w:w="652"/>
+            <w:tcMar>
+              <w:top w:w="65" w:type="dxa"/>
+              <w:left w:w="80" w:type="dxa"/>
+              <w:bottom w:w="65" w:type="dxa"/>
+              <w:right w:w="80" w:type="dxa"/>
+            </w:tcMar>
+          </w:tcPr>
+          <w:p>
+            <w:pPr>
+              <w:spacing w:after="40" w:before="40" w:line="252" w:lineRule="auto"/>
+            </w:pPr>
+            <w:r>
+              <w:rPr>
+                <w:rFonts w:ascii="Arial" w:hAnsi="Arial"/>
+                <w:b/>
+                <w:color w:val="000000"/>
+                <w:sz w:val="18"/>
+              </w:rPr>
+              <w:t>3(b)</w:t>
+            </w:r>
+          </w:p>
+        </w:tc>
+        <w:tc>
+          <w:tcPr>
+            <w:tcW w:type="dxa" w:w="1616"/>
+            <w:tcMar>
+              <w:top w:w="65" w:type="dxa"/>
+              <w:left w:w="80" w:type="dxa"/>
+              <w:bottom w:w="65" w:type="dxa"/>
+              <w:right w:w="80" w:type="dxa"/>
+            </w:tcMar>
+          </w:tcPr>
+          <w:p>
+            <w:pPr>
+              <w:spacing w:after="40" w:before="40" w:line="252" w:lineRule="auto"/>
+            </w:pPr>
+            <w:r>
+              <w:rPr>
+                <w:rFonts w:ascii="Arial" w:hAnsi="Arial"/>
+                <w:b w:val="0"/>
+                <w:color w:val="000000"/>
+                <w:sz w:val="18"/>
+              </w:rPr>
+              <w:t>17 to 18 March 2024</w:t>
+            </w:r>
+          </w:p>
+        </w:tc>
+        <w:tc>
+          <w:tcPr>
+            <w:tcW w:type="dxa" w:w="2296"/>
+            <w:tcMar>
+              <w:top w:w="65" w:type="dxa"/>
+              <w:left w:w="80" w:type="dxa"/>
+              <w:bottom w:w="65" w:type="dxa"/>
+              <w:right w:w="80" w:type="dxa"/>
+            </w:tcMar>
+          </w:tcPr>
+          <w:p>
+            <w:pPr>
+              <w:spacing w:after="40" w:before="40" w:line="252" w:lineRule="auto"/>
+            </w:pPr>
+            <w:r>
+              <w:rPr>
+                <w:rFonts w:ascii="Arial" w:hAnsi="Arial"/>
+                <w:b w:val="0"/>
+                <w:color w:val="000000"/>
+                <w:sz w:val="18"/>
+              </w:rPr>
+              <w:t>Consecutive shifts and the seven-hour break</w:t>
+            </w:r>
+          </w:p>
+        </w:tc>
+        <w:tc>
+          <w:tcPr>
+            <w:tcW w:type="dxa" w:w="5017"/>
+            <w:tcMar>
+              <w:top w:w="65" w:type="dxa"/>
+              <w:left w:w="80" w:type="dxa"/>
+              <w:bottom w:w="65" w:type="dxa"/>
+              <w:right w:w="80" w:type="dxa"/>
+            </w:tcMar>
+          </w:tcPr>
+          <w:p>
+            <w:pPr>
+              <w:spacing w:after="40" w:before="40" w:line="252" w:lineRule="auto"/>
+            </w:pPr>
+            <w:r>
+              <w:rPr>
+                <w:rFonts w:ascii="Arial" w:hAnsi="Arial"/>
+                <w:b w:val="0"/>
+                <w:color w:val="000000"/>
+                <w:sz w:val="18"/>
+              </w:rPr>
+              <w:t>Rostered interval, travel, rest and workload relied on in their operational context.</w:t>
+            </w:r>
+          </w:p>
+        </w:tc>
+      </w:tr>
+      <w:tr>
+        <w:trPr/>
+        <w:tc>
+          <w:tcPr>
+            <w:tcW w:type="dxa" w:w="652"/>
+            <w:tcMar>
+              <w:top w:w="65" w:type="dxa"/>
+              <w:left w:w="80" w:type="dxa"/>
+              <w:bottom w:w="65" w:type="dxa"/>
+              <w:right w:w="80" w:type="dxa"/>
+            </w:tcMar>
+          </w:tcPr>
+          <w:p>
+            <w:pPr>
+              <w:spacing w:after="40" w:before="40" w:line="252" w:lineRule="auto"/>
+            </w:pPr>
+            <w:r>
+              <w:rPr>
+                <w:rFonts w:ascii="Arial" w:hAnsi="Arial"/>
+                <w:b/>
+                <w:color w:val="000000"/>
+                <w:sz w:val="18"/>
+              </w:rPr>
+              <w:t>3(c)</w:t>
+            </w:r>
+          </w:p>
+        </w:tc>
+        <w:tc>
+          <w:tcPr>
+            <w:tcW w:type="dxa" w:w="1616"/>
+            <w:tcMar>
+              <w:top w:w="65" w:type="dxa"/>
+              <w:left w:w="80" w:type="dxa"/>
+              <w:bottom w:w="65" w:type="dxa"/>
+              <w:right w:w="80" w:type="dxa"/>
+            </w:tcMar>
+          </w:tcPr>
+          <w:p>
+            <w:pPr>
+              <w:spacing w:after="40" w:before="40" w:line="252" w:lineRule="auto"/>
+            </w:pPr>
+            <w:r>
+              <w:rPr>
+                <w:rFonts w:ascii="Arial" w:hAnsi="Arial"/>
+                <w:b w:val="0"/>
+                <w:color w:val="000000"/>
+                <w:sz w:val="18"/>
+              </w:rPr>
+              <w:t>19 March 2024</w:t>
+            </w:r>
+          </w:p>
+        </w:tc>
+        <w:tc>
+          <w:tcPr>
+            <w:tcW w:type="dxa" w:w="2296"/>
+            <w:tcMar>
+              <w:top w:w="65" w:type="dxa"/>
+              <w:left w:w="80" w:type="dxa"/>
+              <w:bottom w:w="65" w:type="dxa"/>
+              <w:right w:w="80" w:type="dxa"/>
+            </w:tcMar>
+          </w:tcPr>
+          <w:p>
+            <w:pPr>
+              <w:spacing w:after="40" w:before="40" w:line="252" w:lineRule="auto"/>
+            </w:pPr>
+            <w:r>
+              <w:rPr>
+                <w:rFonts w:ascii="Arial" w:hAnsi="Arial"/>
+                <w:b w:val="0"/>
+                <w:color w:val="000000"/>
+                <w:sz w:val="18"/>
+              </w:rPr>
+              <w:t>Sick leave after the consecutive shifts</w:t>
+            </w:r>
+          </w:p>
+        </w:tc>
+        <w:tc>
+          <w:tcPr>
+            <w:tcW w:type="dxa" w:w="5017"/>
+            <w:tcMar>
+              <w:top w:w="65" w:type="dxa"/>
+              <w:left w:w="80" w:type="dxa"/>
+              <w:bottom w:w="65" w:type="dxa"/>
+              <w:right w:w="80" w:type="dxa"/>
+            </w:tcMar>
+          </w:tcPr>
+          <w:p>
+            <w:pPr>
+              <w:spacing w:after="40" w:before="40" w:line="252" w:lineRule="auto"/>
+            </w:pPr>
+            <w:r>
+              <w:rPr>
+                <w:rFonts w:ascii="Arial" w:hAnsi="Arial"/>
+                <w:b w:val="0"/>
+                <w:color w:val="000000"/>
+                <w:sz w:val="18"/>
+              </w:rPr>
+              <w:t>The record shows 7.60 hours of approved sick leave; the fatigue entitlement is disputed.</w:t>
+            </w:r>
+          </w:p>
+        </w:tc>
+      </w:tr>
+      <w:tr>
+        <w:trPr/>
+        <w:tc>
+          <w:tcPr>
+            <w:tcW w:type="dxa" w:w="652"/>
+            <w:tcMar>
+              <w:top w:w="65" w:type="dxa"/>
+              <w:left w:w="80" w:type="dxa"/>
+              <w:bottom w:w="65" w:type="dxa"/>
+              <w:right w:w="80" w:type="dxa"/>
+            </w:tcMar>
+          </w:tcPr>
+          <w:p>
+            <w:pPr>
+              <w:spacing w:after="40" w:before="40" w:line="252" w:lineRule="auto"/>
+            </w:pPr>
+            <w:r>
+              <w:rPr>
+                <w:rFonts w:ascii="Arial" w:hAnsi="Arial"/>
+                <w:b/>
+                <w:color w:val="000000"/>
+                <w:sz w:val="18"/>
+              </w:rPr>
+              <w:t>3(d)</w:t>
+            </w:r>
+          </w:p>
+        </w:tc>
+        <w:tc>
+          <w:tcPr>
+            <w:tcW w:type="dxa" w:w="1616"/>
+            <w:tcMar>
+              <w:top w:w="65" w:type="dxa"/>
+              <w:left w:w="80" w:type="dxa"/>
+              <w:bottom w:w="65" w:type="dxa"/>
+              <w:right w:w="80" w:type="dxa"/>
+            </w:tcMar>
+          </w:tcPr>
+          <w:p>
+            <w:pPr>
+              <w:spacing w:after="40" w:before="40" w:line="252" w:lineRule="auto"/>
+            </w:pPr>
+            <w:r>
+              <w:rPr>
+                <w:rFonts w:ascii="Arial" w:hAnsi="Arial"/>
+                <w:b w:val="0"/>
+                <w:color w:val="000000"/>
+                <w:sz w:val="18"/>
+              </w:rPr>
+              <w:t>8 April to 1 May 2024</w:t>
+            </w:r>
+          </w:p>
+        </w:tc>
+        <w:tc>
+          <w:tcPr>
+            <w:tcW w:type="dxa" w:w="2296"/>
+            <w:tcMar>
+              <w:top w:w="65" w:type="dxa"/>
+              <w:left w:w="80" w:type="dxa"/>
+              <w:bottom w:w="65" w:type="dxa"/>
+              <w:right w:w="80" w:type="dxa"/>
+            </w:tcMar>
+          </w:tcPr>
+          <w:p>
+            <w:pPr>
+              <w:spacing w:after="40" w:before="40" w:line="252" w:lineRule="auto"/>
+            </w:pPr>
+            <w:r>
+              <w:rPr>
+                <w:rFonts w:ascii="Arial" w:hAnsi="Arial"/>
+                <w:b w:val="0"/>
+                <w:color w:val="000000"/>
+                <w:sz w:val="18"/>
+              </w:rPr>
+              <w:t>Fatigue enquiry and refusal</w:t>
+            </w:r>
+          </w:p>
+        </w:tc>
+        <w:tc>
+          <w:tcPr>
+            <w:tcW w:type="dxa" w:w="5017"/>
+            <w:tcMar>
+              <w:top w:w="65" w:type="dxa"/>
+              <w:left w:w="80" w:type="dxa"/>
+              <w:bottom w:w="65" w:type="dxa"/>
+              <w:right w:w="80" w:type="dxa"/>
+            </w:tcMar>
+          </w:tcPr>
+          <w:p>
+            <w:pPr>
+              <w:spacing w:after="40" w:before="40" w:line="252" w:lineRule="auto"/>
+            </w:pPr>
+            <w:r>
+              <w:rPr>
+                <w:rFonts w:ascii="Arial" w:hAnsi="Arial"/>
+                <w:b w:val="0"/>
+                <w:color w:val="000000"/>
+                <w:sz w:val="18"/>
+              </w:rPr>
+              <w:t>Acknowledged on 9 April; substantive response and refusal after 23 days.</w:t>
+            </w:r>
+          </w:p>
+        </w:tc>
+      </w:tr>
+      <w:tr>
+        <w:trPr/>
+        <w:tc>
+          <w:tcPr>
+            <w:tcW w:type="dxa" w:w="652"/>
+            <w:tcMar>
+              <w:top w:w="65" w:type="dxa"/>
+              <w:left w:w="80" w:type="dxa"/>
+              <w:bottom w:w="65" w:type="dxa"/>
+              <w:right w:w="80" w:type="dxa"/>
+            </w:tcMar>
+          </w:tcPr>
+          <w:p>
+            <w:pPr>
+              <w:spacing w:after="40" w:before="40" w:line="252" w:lineRule="auto"/>
+            </w:pPr>
+            <w:r>
+              <w:rPr>
+                <w:rFonts w:ascii="Arial" w:hAnsi="Arial"/>
+                <w:b/>
+                <w:color w:val="000000"/>
+                <w:sz w:val="18"/>
+              </w:rPr>
+              <w:t>3(e)</w:t>
+            </w:r>
+          </w:p>
+        </w:tc>
+        <w:tc>
+          <w:tcPr>
+            <w:tcW w:type="dxa" w:w="1616"/>
+            <w:tcMar>
+              <w:top w:w="65" w:type="dxa"/>
+              <w:left w:w="80" w:type="dxa"/>
+              <w:bottom w:w="65" w:type="dxa"/>
+              <w:right w:w="80" w:type="dxa"/>
+            </w:tcMar>
+          </w:tcPr>
+          <w:p>
+            <w:pPr>
+              <w:spacing w:after="40" w:before="40" w:line="252" w:lineRule="auto"/>
+            </w:pPr>
+            <w:r>
+              <w:rPr>
+                <w:rFonts w:ascii="Arial" w:hAnsi="Arial"/>
+                <w:b w:val="0"/>
+                <w:color w:val="000000"/>
+                <w:sz w:val="18"/>
+              </w:rPr>
+              <w:t>16 to 26 April 2024</w:t>
+            </w:r>
+          </w:p>
+        </w:tc>
+        <w:tc>
+          <w:tcPr>
+            <w:tcW w:type="dxa" w:w="2296"/>
+            <w:tcMar>
+              <w:top w:w="65" w:type="dxa"/>
+              <w:left w:w="80" w:type="dxa"/>
+              <w:bottom w:w="65" w:type="dxa"/>
+              <w:right w:w="80" w:type="dxa"/>
+            </w:tcMar>
+          </w:tcPr>
+          <w:p>
+            <w:pPr>
+              <w:spacing w:after="40" w:before="40" w:line="252" w:lineRule="auto"/>
+            </w:pPr>
+            <w:r>
+              <w:rPr>
+                <w:rFonts w:ascii="Arial" w:hAnsi="Arial"/>
+                <w:b w:val="0"/>
+                <w:color w:val="000000"/>
+                <w:sz w:val="18"/>
+              </w:rPr>
+              <w:t>Roster line error and proposed alternatives</w:t>
+            </w:r>
+          </w:p>
+        </w:tc>
+        <w:tc>
+          <w:tcPr>
+            <w:tcW w:type="dxa" w:w="5017"/>
+            <w:tcMar>
+              <w:top w:w="65" w:type="dxa"/>
+              <w:left w:w="80" w:type="dxa"/>
+              <w:bottom w:w="65" w:type="dxa"/>
+              <w:right w:w="80" w:type="dxa"/>
+            </w:tcMar>
+          </w:tcPr>
+          <w:p>
+            <w:pPr>
+              <w:spacing w:after="40" w:before="40" w:line="252" w:lineRule="auto"/>
+            </w:pPr>
+            <w:r>
+              <w:rPr>
+                <w:rFonts w:ascii="Arial" w:hAnsi="Arial"/>
+                <w:b w:val="0"/>
+                <w:color w:val="000000"/>
+                <w:sz w:val="18"/>
+              </w:rPr>
+              <w:t>Error acknowledged after the meeting; no subsequent contact about alternatives is alleged.</w:t>
+            </w:r>
+          </w:p>
+        </w:tc>
+      </w:tr>
+      <w:tr>
+        <w:trPr/>
+        <w:tc>
+          <w:tcPr>
+            <w:tcW w:type="dxa" w:w="652"/>
+            <w:tcMar>
+              <w:top w:w="65" w:type="dxa"/>
+              <w:left w:w="80" w:type="dxa"/>
+              <w:bottom w:w="65" w:type="dxa"/>
+              <w:right w:w="80" w:type="dxa"/>
+            </w:tcMar>
+          </w:tcPr>
+          <w:p>
+            <w:pPr>
+              <w:spacing w:after="40" w:before="40" w:line="252" w:lineRule="auto"/>
+            </w:pPr>
+            <w:r>
+              <w:rPr>
+                <w:rFonts w:ascii="Arial" w:hAnsi="Arial"/>
+                <w:b/>
+                <w:color w:val="000000"/>
+                <w:sz w:val="18"/>
+              </w:rPr>
+              <w:t>3(f)</w:t>
+            </w:r>
+          </w:p>
+        </w:tc>
+        <w:tc>
+          <w:tcPr>
+            <w:tcW w:type="dxa" w:w="1616"/>
+            <w:tcMar>
+              <w:top w:w="65" w:type="dxa"/>
+              <w:left w:w="80" w:type="dxa"/>
+              <w:bottom w:w="65" w:type="dxa"/>
+              <w:right w:w="80" w:type="dxa"/>
+            </w:tcMar>
+          </w:tcPr>
+          <w:p>
+            <w:pPr>
+              <w:spacing w:after="40" w:before="40" w:line="252" w:lineRule="auto"/>
+            </w:pPr>
+            <w:r>
+              <w:rPr>
+                <w:rFonts w:ascii="Arial" w:hAnsi="Arial"/>
+                <w:b w:val="0"/>
+                <w:color w:val="000000"/>
+                <w:sz w:val="18"/>
+              </w:rPr>
+              <w:t>1 to 8 May 2024</w:t>
+            </w:r>
+          </w:p>
+        </w:tc>
+        <w:tc>
+          <w:tcPr>
+            <w:tcW w:type="dxa" w:w="2296"/>
+            <w:tcMar>
+              <w:top w:w="65" w:type="dxa"/>
+              <w:left w:w="80" w:type="dxa"/>
+              <w:bottom w:w="65" w:type="dxa"/>
+              <w:right w:w="80" w:type="dxa"/>
+            </w:tcMar>
+          </w:tcPr>
+          <w:p>
+            <w:pPr>
+              <w:spacing w:after="40" w:before="40" w:line="252" w:lineRule="auto"/>
+            </w:pPr>
+            <w:r>
+              <w:rPr>
+                <w:rFonts w:ascii="Arial" w:hAnsi="Arial"/>
+                <w:b w:val="0"/>
+                <w:color w:val="000000"/>
+                <w:sz w:val="18"/>
+              </w:rPr>
+              <w:t>Fatigue toolkit raised and HR advice awaited</w:t>
+            </w:r>
+          </w:p>
+        </w:tc>
+        <w:tc>
+          <w:tcPr>
+            <w:tcW w:type="dxa" w:w="5017"/>
+            <w:tcMar>
+              <w:top w:w="65" w:type="dxa"/>
+              <w:left w:w="80" w:type="dxa"/>
+              <w:bottom w:w="65" w:type="dxa"/>
+              <w:right w:w="80" w:type="dxa"/>
+            </w:tcMar>
+          </w:tcPr>
+          <w:p>
+            <w:pPr>
+              <w:spacing w:after="40" w:before="40" w:line="252" w:lineRule="auto"/>
+            </w:pPr>
+            <w:r>
+              <w:rPr>
+                <w:rFonts w:ascii="Arial" w:hAnsi="Arial"/>
+                <w:b w:val="0"/>
+                <w:color w:val="000000"/>
+                <w:sz w:val="18"/>
+              </w:rPr>
+              <w:t>The Appellant sought action on the toolkit; Reese said she was awaiting advice.</w:t>
+            </w:r>
+          </w:p>
+        </w:tc>
+      </w:tr>
+      <w:tr>
+        <w:trPr/>
+        <w:tc>
+          <w:tcPr>
+            <w:tcW w:type="dxa" w:w="652"/>
+            <w:tcMar>
+              <w:top w:w="65" w:type="dxa"/>
+              <w:left w:w="80" w:type="dxa"/>
+              <w:bottom w:w="65" w:type="dxa"/>
+              <w:right w:w="80" w:type="dxa"/>
+            </w:tcMar>
+          </w:tcPr>
+          <w:p>
+            <w:pPr>
+              <w:spacing w:after="40" w:before="40" w:line="252" w:lineRule="auto"/>
+            </w:pPr>
+            <w:r>
+              <w:rPr>
+                <w:rFonts w:ascii="Arial" w:hAnsi="Arial"/>
+                <w:b/>
+                <w:color w:val="000000"/>
+                <w:sz w:val="18"/>
+              </w:rPr>
+              <w:t>3(g)</w:t>
+            </w:r>
+          </w:p>
+        </w:tc>
+        <w:tc>
+          <w:tcPr>
+            <w:tcW w:type="dxa" w:w="1616"/>
+            <w:tcMar>
+              <w:top w:w="65" w:type="dxa"/>
+              <w:left w:w="80" w:type="dxa"/>
+              <w:bottom w:w="65" w:type="dxa"/>
+              <w:right w:w="80" w:type="dxa"/>
+            </w:tcMar>
+          </w:tcPr>
+          <w:p>
+            <w:pPr>
+              <w:spacing w:after="40" w:before="40" w:line="252" w:lineRule="auto"/>
+            </w:pPr>
+            <w:r>
+              <w:rPr>
+                <w:rFonts w:ascii="Arial" w:hAnsi="Arial"/>
+                <w:b w:val="0"/>
+                <w:color w:val="000000"/>
+                <w:sz w:val="18"/>
+              </w:rPr>
+              <w:t>10 May 2024</w:t>
+            </w:r>
+          </w:p>
+        </w:tc>
+        <w:tc>
+          <w:tcPr>
+            <w:tcW w:type="dxa" w:w="2296"/>
+            <w:tcMar>
+              <w:top w:w="65" w:type="dxa"/>
+              <w:left w:w="80" w:type="dxa"/>
+              <w:bottom w:w="65" w:type="dxa"/>
+              <w:right w:w="80" w:type="dxa"/>
+            </w:tcMar>
+          </w:tcPr>
+          <w:p>
+            <w:pPr>
+              <w:spacing w:after="40" w:before="40" w:line="252" w:lineRule="auto"/>
+            </w:pPr>
+            <w:r>
+              <w:rPr>
+                <w:rFonts w:ascii="Arial" w:hAnsi="Arial"/>
+                <w:b w:val="0"/>
+                <w:color w:val="000000"/>
+                <w:sz w:val="18"/>
+              </w:rPr>
+              <w:t>Risk rating and roster decision recorded</w:t>
+            </w:r>
+          </w:p>
+        </w:tc>
+        <w:tc>
+          <w:tcPr>
+            <w:tcW w:type="dxa" w:w="5017"/>
+            <w:tcMar>
+              <w:top w:w="65" w:type="dxa"/>
+              <w:left w:w="80" w:type="dxa"/>
+              <w:bottom w:w="65" w:type="dxa"/>
+              <w:right w:w="80" w:type="dxa"/>
+            </w:tcMar>
+          </w:tcPr>
+          <w:p>
+            <w:pPr>
+              <w:spacing w:after="40" w:before="40" w:line="252" w:lineRule="auto"/>
+            </w:pPr>
+            <w:r>
+              <w:rPr>
+                <w:rFonts w:ascii="Arial" w:hAnsi="Arial"/>
+                <w:b w:val="0"/>
+                <w:color w:val="000000"/>
+                <w:sz w:val="18"/>
+              </w:rPr>
+              <w:t>Reese recorded personal fatigue concerns, a moderate rating and an undisclosed roster decision.</w:t>
+            </w:r>
+          </w:p>
+        </w:tc>
+      </w:tr>
+      <w:tr>
+        <w:trPr/>
+        <w:tc>
+          <w:tcPr>
+            <w:tcW w:type="dxa" w:w="652"/>
+            <w:tcMar>
+              <w:top w:w="65" w:type="dxa"/>
+              <w:left w:w="80" w:type="dxa"/>
+              <w:bottom w:w="65" w:type="dxa"/>
+              <w:right w:w="80" w:type="dxa"/>
+            </w:tcMar>
+          </w:tcPr>
+          <w:p>
+            <w:pPr>
+              <w:spacing w:after="40" w:before="40" w:line="252" w:lineRule="auto"/>
+            </w:pPr>
+            <w:r>
+              <w:rPr>
+                <w:rFonts w:ascii="Arial" w:hAnsi="Arial"/>
+                <w:b/>
+                <w:color w:val="000000"/>
+                <w:sz w:val="18"/>
+              </w:rPr>
+              <w:t>3(h)</w:t>
+            </w:r>
+          </w:p>
+        </w:tc>
+        <w:tc>
+          <w:tcPr>
+            <w:tcW w:type="dxa" w:w="1616"/>
+            <w:tcMar>
+              <w:top w:w="65" w:type="dxa"/>
+              <w:left w:w="80" w:type="dxa"/>
+              <w:bottom w:w="65" w:type="dxa"/>
+              <w:right w:w="80" w:type="dxa"/>
+            </w:tcMar>
+          </w:tcPr>
+          <w:p>
+            <w:pPr>
+              <w:spacing w:after="40" w:before="40" w:line="252" w:lineRule="auto"/>
+            </w:pPr>
+            <w:r>
+              <w:rPr>
+                <w:rFonts w:ascii="Arial" w:hAnsi="Arial"/>
+                <w:b w:val="0"/>
+                <w:color w:val="000000"/>
+                <w:sz w:val="18"/>
+              </w:rPr>
+              <w:t>20 May 2024</w:t>
+            </w:r>
+          </w:p>
+        </w:tc>
+        <w:tc>
+          <w:tcPr>
+            <w:tcW w:type="dxa" w:w="2296"/>
+            <w:tcMar>
+              <w:top w:w="65" w:type="dxa"/>
+              <w:left w:w="80" w:type="dxa"/>
+              <w:bottom w:w="65" w:type="dxa"/>
+              <w:right w:w="80" w:type="dxa"/>
+            </w:tcMar>
+          </w:tcPr>
+          <w:p>
+            <w:pPr>
+              <w:spacing w:after="40" w:before="40" w:line="252" w:lineRule="auto"/>
+            </w:pPr>
+            <w:r>
+              <w:rPr>
+                <w:rFonts w:ascii="Arial" w:hAnsi="Arial"/>
+                <w:b w:val="0"/>
+                <w:color w:val="000000"/>
+                <w:sz w:val="18"/>
+              </w:rPr>
+              <w:t>HR follow-up with the fatigue guideline</w:t>
+            </w:r>
+          </w:p>
+        </w:tc>
+        <w:tc>
+          <w:tcPr>
+            <w:tcW w:type="dxa" w:w="5017"/>
+            <w:tcMar>
+              <w:top w:w="65" w:type="dxa"/>
+              <w:left w:w="80" w:type="dxa"/>
+              <w:bottom w:w="65" w:type="dxa"/>
+              <w:right w:w="80" w:type="dxa"/>
+            </w:tcMar>
+          </w:tcPr>
+          <w:p>
+            <w:pPr>
+              <w:spacing w:after="40" w:before="40" w:line="252" w:lineRule="auto"/>
+            </w:pPr>
+            <w:r>
+              <w:rPr>
+                <w:rFonts w:ascii="Arial" w:hAnsi="Arial"/>
+                <w:b w:val="0"/>
+                <w:color w:val="000000"/>
+                <w:sz w:val="18"/>
+              </w:rPr>
+              <w:t>Reese followed up her earlier query and attached the guideline.</w:t>
+            </w:r>
+          </w:p>
+        </w:tc>
+      </w:tr>
+    </w:tbl>
+    <w:p/>
     <w:sectPr>
       <w:pgSz w:w="11906" w:h="16838"/>
       <w:pgMar w:top="1000" w:right="1134" w:bottom="900" w:left="1134" w:header="567" w:footer="567" w:gutter="0"/>

</xml_diff>

<commit_message>
Change 61: the eight changes from the Dwyer read; single drift check clean
Co-Authored-By: Claude Opus 5.5 <noreply@anthropic.com>
Claude-Session: https://claude.ai/code/session_01PbSZiMB1koFR46V5hQyVcy
</commit_message>
<xml_diff>
--- a/wc2024227/drafts/second-amended-9A/v2_1Oct2026_your_structure/2026-10_LETTER_to_Registry_FINAL.docx
+++ b/wc2024227/drafts/second-amended-9A/v2_1Oct2026_your_structure/2026-10_LETTER_to_Registry_FINAL.docx
@@ -212,7 +212,7 @@
           <w:sz w:val="19"/>
           <w:szCs w:val="19"/>
         </w:rPr>
-        <w:t>Directions 3 and 4 of the Further Directions Order (3) required the Respondent's list of witnesses, its outlines of evidence and any expert reports that will be relied upon by 4.00 pm on 30 September 2026. On 24 September 2026 it sent its list to the Registry for filing, naming four witnesses, Ms Taylor, Ms Reese, Ms Wright and Ms Earl, described as "lay" witnesses, and served outlines of their evidence. Neither the list nor the outlines names a medical or expert witness, and no expert report has been served as at 30 September 2026. The Respondent's amended statement of facts and contentions of 13 May 2026 does not admit the pleaded onset and diagnosis of the injury, saying these are "matters for determination by the Commission at a hearing" (paragraph 9), and identifies no expert evidence. Its response of 8 September 2026 to the notices to admit names no medical or expert witness, and the documents listed under the headings "Medical Certificates" and "Medical" in its amended List of Documents of 14 August 2026 are those of the treating practitioners (items 7 to 11).</w:t>
+        <w:t>Directions 3 and 4 of the Further Directions Order (3) required the Respondent's list of witnesses, its outlines of evidence and any expert reports that will be relied upon by 4.00 pm on 30 September 2026. On 24 September 2026 it sent its list to the Registry for filing, naming four witnesses, Ms Taylor, Ms Reese, Ms Wright and Ms Earl, described as "lay" witnesses, and served outlines of their evidence. The Respondent's amended statement of facts and contentions of 13 May 2026 does not admit the pleaded onset and diagnosis of the injury, saying these are "matters for determination by the Commission at a hearing" (paragraph 9), and identifies no expert evidence. Its response of 8 September 2026 to the notices to admit names no medical or expert witness, and the documents listed under the headings "Medical Certificates" and "Medical" in its amended List of Documents of 14 August 2026 are those of the treating practitioners (items 7 to 11).</w:t>
       </w:r>
     </w:p>
     <w:p>
@@ -329,6 +329,19 @@
       <w:r>
         <w:rPr>
           <w:rFonts w:ascii="Arial" w:hAnsi="Arial" w:cs="Arial"/>
+          <w:sz w:val="19"/>
+          <w:szCs w:val="19"/>
+        </w:rPr>
+        <w:t>This letter accompanies the Appellant's election and requested directions. Enclosure: Second Amended Statement of Facts and Contentions (Form 9A).</w:t>
+      </w:r>
+    </w:p>
+    <w:p>
+      <w:pPr>
+        <w:spacing w:before="0" w:after="80" w:line="264" w:lineRule="auto"/>
+      </w:pPr>
+      <w:r>
+        <w:rPr>
+          <w:rFonts w:ascii="Arial" w:hAnsi="Arial" w:cs="Arial"/>
           <w:b/>
           <w:sz w:val="19"/>
           <w:szCs w:val="19"/>
@@ -6468,6 +6481,19 @@
     </w:p>
     <w:p>
       <w:pPr>
+        <w:spacing w:before="0" w:after="80" w:line="264" w:lineRule="auto"/>
+      </w:pPr>
+      <w:r>
+        <w:rPr>
+          <w:rFonts w:ascii="Arial" w:hAnsi="Arial" w:cs="Arial"/>
+          <w:sz w:val="19"/>
+          <w:szCs w:val="19"/>
+        </w:rPr>
+        <w:t>The Appellant asked the Respondent on 9 September 2026 to confirm the ten outstanding documents. The Respondent's email of 23 September 2026 gives no date by which the copies are expected, and does not refer to Tab 24, which is a Together Queensland document, not a Metro South Health document. The nine documents the Respondent referred to Metro South Health are Metro South Health documents. The copies of Tabs 1, 5, 17 to 19, 21 to 24 and 31 came from the Appellant's own records; Tabs 17 to 19, 22 and 23 bear the signature of the employer's Director, Corporate Services. If Metro South produces the same documents to the Respondent, and the Respondent discloses them back to the Appellant, he will receive documents he already holds.</w:t>
+      </w:r>
+    </w:p>
+    <w:p>
+      <w:pPr>
         <w:keepNext/>
         <w:spacing w:before="0" w:after="120" w:line="264" w:lineRule="auto"/>
       </w:pPr>
@@ -6626,7 +6652,7 @@
                 <w:color w:val="000000"/>
                 <w:sz w:val="18"/>
               </w:rPr>
-              <w:t>1(i), 2(n) to 2(o), 3(c); Stressor 3 agreement and pleaded-answer paragraphs; Part C, paragraph 5A</w:t>
+              <w:t>1(l), 2(n) to 2(o), 3(c); Stressor 3 agreement and pleaded-answer paragraphs; Part C, paragraph 5A</w:t>
             </w:r>
           </w:p>
         </w:tc>
@@ -7044,27 +7070,27 @@
                 <w:sz w:val="16"/>
                 <w:szCs w:val="16"/>
               </w:rPr>
-              <w:t xml:space="preserve">The Respondent's disclosure of 11 June 2026 (10 pages): the leave-form walkthrough for Process Reference 15480560, the emails of 15 May 2024 at 1:15 pm and 6:23 pm, the emails of 15 and 16 May 2024 concerning the complaint of 13 May 2024, and the complaint form</w:t>
-            </w:r>
-          </w:p>
-        </w:tc>
-        <w:tc>
-          <w:tcPr>
-            <w:tcMar>
-              <w:top w:w="65" w:type="dxa"/>
-              <w:left w:w="80" w:type="dxa"/>
-              <w:bottom w:w="65" w:type="dxa"/>
-              <w:right w:w="80" w:type="dxa"/>
-            </w:tcMar>
-          </w:tcPr>
-          <w:p>
-            <w:r>
-              <w:rPr>
-                <w:rFonts w:ascii="Arial" w:hAnsi="Arial"/>
-                <w:color w:val="000000"/>
-                <w:sz w:val="18"/>
-              </w:rPr>
-              <w:t>Stressor 1(i), for dates, senders and recipients only</w:t>
+              <w:t xml:space="preserve">The Respondent's disclosure of 11 June 2026 (10 pages): the leave-form walkthrough for Process Reference 15480560, the emails of 15 May 2024 at 1:15 pm and 6:23 pm, and documents concerning the complaint of 13 May 2024</w:t>
+            </w:r>
+          </w:p>
+        </w:tc>
+        <w:tc>
+          <w:tcPr>
+            <w:tcMar>
+              <w:top w:w="65" w:type="dxa"/>
+              <w:left w:w="80" w:type="dxa"/>
+              <w:bottom w:w="65" w:type="dxa"/>
+              <w:right w:w="80" w:type="dxa"/>
+            </w:tcMar>
+          </w:tcPr>
+          <w:p>
+            <w:r>
+              <w:rPr>
+                <w:rFonts w:ascii="Arial" w:hAnsi="Arial"/>
+                <w:color w:val="000000"/>
+                <w:sz w:val="18"/>
+              </w:rPr>
+              <w:t>Stressors 1(e) and 1(l); for 1(i), the date of the complaint only</w:t>
             </w:r>
           </w:p>
         </w:tc>
@@ -7332,19 +7358,6 @@
       <w:r>
         <w:rPr>
           <w:rFonts w:ascii="Arial" w:hAnsi="Arial" w:cs="Arial"/>
-          <w:sz w:val="19"/>
-          <w:szCs w:val="19"/>
-        </w:rPr>
-        <w:t>The Appellant asked the Respondent on 9 September 2026 to confirm the ten outstanding documents. The Respondent's email of 23 September 2026 gives no date by which the copies are expected, and does not refer to Tab 24, which is a Together Queensland document, not a Metro South Health document. The nine documents the Respondent referred to Metro South Health are Metro South Health documents. The copies of Tabs 1, 5, 17 to 19, 21 to 24 and 31 came from the Appellant's own records; Tabs 17 to 19, 22 and 23 bear the signature of the employer's Director, Corporate Services. If Metro South produces the same documents to the Respondent, and the Respondent discloses them back to the Appellant, he will receive documents he already holds. This letter accompanies the Appellant's election and requested directions. Enclosure: Second Amended Statement of Facts and Contentions (Form 9A).</w:t>
-      </w:r>
-    </w:p>
-    <w:p>
-      <w:pPr>
-        <w:spacing w:before="0" w:after="80" w:line="264" w:lineRule="auto"/>
-      </w:pPr>
-      <w:r>
-        <w:rPr>
-          <w:rFonts w:ascii="Arial" w:hAnsi="Arial" w:cs="Arial"/>
           <w:b/>
           <w:sz w:val="19"/>
           <w:szCs w:val="19"/>
@@ -7357,7 +7370,7 @@
           <w:sz w:val="19"/>
           <w:szCs w:val="19"/>
         </w:rPr>
-        <w:t xml:space="preserve">The three stressors are pleaded, with their particulars, in the Second Amended Form 9A; this index adds no stressor or particular. The causal particulars are 1(b), 1(d), 1(f) to 1(h), 1(k) and 1(l); 2(a) to 2(j) and 2(l) to 2(n); and 3(b) to 3(h). The others, 1(a), 1(c), 1(e), 1(i), 1(j), 2(k), 2(o) and 3(a), are context and are not relied on as separate causes.</w:t>
+        <w:t xml:space="preserve">The three stressors are pleaded, with their particulars, in the Second Amended Form 9A; this index adds no stressor or particular. The causal particulars are 1(b), 1(d), 1(f) to 1(h), 1(k) and 1(l); 2(a) to 2(i) and 2(l) to 2(n); and 3(b) to 3(h). The others, 1(a), 1(c), 1(e), 1(i), 1(j), 2(j), 2(k), 2(o) and 3(a), are context and are not relied on as separate causes.</w:t>
       </w:r>
     </w:p>
     <w:tbl>
@@ -8348,7 +8361,7 @@
                 <w:color w:val="000000"/>
                 <w:sz w:val="18"/>
               </w:rPr>
-              <w:t>13 to 21 May 2024</w:t>
+              <w:t>13 May 2024</w:t>
             </w:r>
           </w:p>
         </w:tc>
@@ -8373,7 +8386,7 @@
                 <w:color w:val="000000"/>
                 <w:sz w:val="18"/>
               </w:rPr>
-              <w:t>The complaint of 13 May 2024, and the days that followed</w:t>
+              <w:t>The complaint of 13 May 2024</w:t>
             </w:r>
           </w:p>
         </w:tc>
@@ -8398,7 +8411,7 @@
                 <w:color w:val="000000"/>
                 <w:sz w:val="18"/>
               </w:rPr>
-              <w:t>Complaint and distribution chronology; context only, with no separate causal allegation.</w:t>
+              <w:t>Date of the complaint; chronology only, with no causal allegation.</w:t>
             </w:r>
           </w:p>
         </w:tc>
@@ -9737,7 +9750,7 @@
                 <w:color w:val="000000"/>
                 <w:sz w:val="18"/>
               </w:rPr>
-              <w:t>Process 16328886 was submitted and completed; its relation to the errors needs identification.</w:t>
+              <w:t>Process 16328886 was submitted on 15 May and completed on 16 May; context only.</w:t>
             </w:r>
           </w:p>
         </w:tc>
@@ -9840,7 +9853,7 @@
                 <w:color w:val="000000"/>
                 <w:sz w:val="18"/>
               </w:rPr>
-              <w:t>Reese followed up with HR and attached the fatigue guideline; related context.</w:t>
+              <w:t>The Director followed up with HR and attached the fatigue guideline; related context.</w:t>
             </w:r>
           </w:p>
         </w:tc>
@@ -10870,7 +10883,7 @@
                 <w:color w:val="000000"/>
                 <w:sz w:val="18"/>
               </w:rPr>
-              <w:t>The Appellant sought action on the toolkit; Reese said she was awaiting advice.</w:t>
+              <w:t>The Appellant sought action on the toolkit; the Director said she was awaiting advice.</w:t>
             </w:r>
           </w:p>
         </w:tc>
@@ -10973,7 +10986,7 @@
                 <w:color w:val="000000"/>
                 <w:sz w:val="18"/>
               </w:rPr>
-              <w:t>Reese recorded personal fatigue concerns, a moderate rating and an undisclosed roster decision.</w:t>
+              <w:t>The Director recorded his fatigue concerns, a moderate rating and an undisclosed roster decision.</w:t>
             </w:r>
           </w:p>
         </w:tc>
@@ -11076,7 +11089,7 @@
                 <w:color w:val="000000"/>
                 <w:sz w:val="18"/>
               </w:rPr>
-              <w:t>Reese followed up her earlier query and attached the guideline.</w:t>
+              <w:t>The Director followed up her earlier query and attached the guideline.</w:t>
             </w:r>
           </w:p>
         </w:tc>

</xml_diff>